<commit_message>
actualiza docx historias de usuario
</commit_message>
<xml_diff>
--- a/deliverables/Healthora-Historias-de-Usuario.docx
+++ b/deliverables/Healthora-Historias-de-Usuario.docx
@@ -206,17 +206,14 @@
     </w:p>
     <w:p>
       <w:pPr>
+        <w:jc w:val="center"/>
         <w:rPr>
           <w:lang w:val="en-US"/>
         </w:rPr>
       </w:pPr>
-    </w:p>
-    <w:p>
-      <w:pPr>
-        <w:rPr>
-          <w:lang w:val="en-US"/>
-        </w:rPr>
-      </w:pPr>
+      <w:r>
+        <w:t>Kelvin He 8-999-1950, Roy Barrera 8-1022-2121, Einer Mosquera 8-924-1880</w:t>
+      </w:r>
     </w:p>
     <w:p>
       <w:pPr>
@@ -25433,7 +25430,6 @@
   <w:style w:type="character" w:default="1" w:styleId="DefaultParagraphFont">
     <w:name w:val="Default Paragraph Font"/>
     <w:uiPriority w:val="1"/>
-    <w:semiHidden/>
     <w:unhideWhenUsed/>
   </w:style>
   <w:style w:type="table" w:default="1" w:styleId="TableNormal">

</xml_diff>

<commit_message>
Actualiza documento de historias de usuario
</commit_message>
<xml_diff>
--- a/deliverables/Healthora-Historias-de-Usuario.docx
+++ b/deliverables/Healthora-Historias-de-Usuario.docx
@@ -10441,22 +10441,19 @@
           </w:tcPr>
           <w:p>
             <w:r>
+              <w:t>10</w:t>
+            </w:r>
+          </w:p>
+        </w:tc>
+        <w:tc>
+          <w:tcPr>
+            <w:tcW w:w="1728" w:type="dxa"/>
+          </w:tcPr>
+          <w:p>
+            <w:r>
               <w:rPr>
                 <w:sz w:val="19"/>
               </w:rPr>
-              <w:t>9</w:t>
-            </w:r>
-          </w:p>
-        </w:tc>
-        <w:tc>
-          <w:tcPr>
-            <w:tcW w:w="1728" w:type="dxa"/>
-          </w:tcPr>
-          <w:p>
-            <w:r>
-              <w:rPr>
-                <w:sz w:val="19"/>
-              </w:rPr>
               <w:t>0</w:t>
             </w:r>
           </w:p>
@@ -10467,10 +10464,7 @@
           </w:tcPr>
           <w:p>
             <w:r>
-              <w:rPr>
-                <w:sz w:val="19"/>
-              </w:rPr>
-              <w:t>14</w:t>
+              <w:t>15</w:t>
             </w:r>
           </w:p>
         </w:tc>
@@ -11155,24 +11149,20 @@
           </w:tcPr>
           <w:p>
             <w:r>
+              <w:t>33</w:t>
+            </w:r>
+          </w:p>
+        </w:tc>
+        <w:tc>
+          <w:tcPr>
+            <w:tcW w:w="1728" w:type="dxa"/>
+          </w:tcPr>
+          <w:p>
+            <w:r>
               <w:rPr>
                 <w:b/>
                 <w:sz w:val="19"/>
               </w:rPr>
-              <w:t>32</w:t>
-            </w:r>
-          </w:p>
-        </w:tc>
-        <w:tc>
-          <w:tcPr>
-            <w:tcW w:w="1728" w:type="dxa"/>
-          </w:tcPr>
-          <w:p>
-            <w:r>
-              <w:rPr>
-                <w:b/>
-                <w:sz w:val="19"/>
-              </w:rPr>
               <w:t>28</w:t>
             </w:r>
           </w:p>
@@ -11183,11 +11173,7 @@
           </w:tcPr>
           <w:p>
             <w:r>
-              <w:rPr>
-                <w:b/>
-                <w:sz w:val="19"/>
-              </w:rPr>
-              <w:t>91</w:t>
+              <w:t>92</w:t>
             </w:r>
           </w:p>
         </w:tc>
@@ -17368,6 +17354,73 @@
           </w:p>
         </w:tc>
       </w:tr>
+      <w:tr>
+        <w:tc>
+          <w:tcPr>
+            <w:tcW w:type="dxa" w:w="1728"/>
+          </w:tcPr>
+          <w:p>
+            <w:r>
+              <w:rPr>
+                <w:sz w:val="19"/>
+              </w:rPr>
+              <w:t>RF-31</w:t>
+            </w:r>
+          </w:p>
+        </w:tc>
+        <w:tc>
+          <w:tcPr>
+            <w:tcW w:type="dxa" w:w="1728"/>
+          </w:tcPr>
+          <w:p>
+            <w:r>
+              <w:rPr>
+                <w:sz w:val="19"/>
+              </w:rPr>
+              <w:t>HU-092</w:t>
+            </w:r>
+          </w:p>
+        </w:tc>
+        <w:tc>
+          <w:tcPr>
+            <w:tcW w:type="dxa" w:w="1728"/>
+          </w:tcPr>
+          <w:p>
+            <w:r>
+              <w:rPr>
+                <w:sz w:val="19"/>
+              </w:rPr>
+              <w:t>Descuentos automáticos por producto/categoría</w:t>
+            </w:r>
+          </w:p>
+        </w:tc>
+        <w:tc>
+          <w:tcPr>
+            <w:tcW w:type="dxa" w:w="1728"/>
+          </w:tcPr>
+          <w:p>
+            <w:r>
+              <w:rPr>
+                <w:sz w:val="19"/>
+              </w:rPr>
+              <w:t>Administrador</w:t>
+            </w:r>
+          </w:p>
+        </w:tc>
+        <w:tc>
+          <w:tcPr>
+            <w:tcW w:type="dxa" w:w="1728"/>
+          </w:tcPr>
+          <w:p>
+            <w:r>
+              <w:rPr>
+                <w:sz w:val="19"/>
+              </w:rPr>
+              <w:t>Si</w:t>
+            </w:r>
+          </w:p>
+        </w:tc>
+      </w:tr>
     </w:tbl>
     <w:p>
       <w:pPr>
@@ -21782,6 +21835,191 @@
               </w:rPr>
               <w:lastRenderedPageBreak/>
               <w:t>agente modere contenido inapropiado de forma trazable.</w:t>
+            </w:r>
+          </w:p>
+        </w:tc>
+      </w:tr>
+    </w:tbl>
+    <w:p>
+      <w:pPr>
+        <w:pStyle w:val="Heading3"/>
+      </w:pPr>
+      <w:r>
+        <w:t>HU-092 - Descuentos automáticos por producto y por categoría  [MCP]</w:t>
+      </w:r>
+    </w:p>
+    <w:p>
+      <w:pPr/>
+      <w:r>
+        <w:rPr>
+          <w:color w:val="555555"/>
+          <w:sz w:val="18"/>
+        </w:rPr>
+        <w:t>Estado: Pendiente   |   Prioridad: Media   |   Módulo: Administración   |   Tipo: Funcional</w:t>
+      </w:r>
+    </w:p>
+    <w:p>
+      <w:pPr/>
+      <w:r>
+        <w:rPr>
+          <w:b/>
+        </w:rPr>
+        <w:t xml:space="preserve">Historia: </w:t>
+      </w:r>
+      <w:r>
+        <w:t>Como Administrador, quiero aplicar un descuento (porcentaje o monto fijo) directamente a un producto o a todos los productos de una categoría, para que el precio rebajado se muestre automáticamente en el catálogo sin que el cliente tenga que ingresar ningún código.</w:t>
+      </w:r>
+    </w:p>
+    <w:p>
+      <w:pPr/>
+      <w:r>
+        <w:t>Criterios de aceptación:</w:t>
+      </w:r>
+    </w:p>
+    <w:p>
+      <w:pPr>
+        <w:pStyle w:val="ListBullet"/>
+      </w:pPr>
+      <w:r>
+        <w:t>El admin puede aplicar un descuento (% o monto fijo) a un producto individual, con vigencia opcional (fecha de inicio y fin).</w:t>
+      </w:r>
+    </w:p>
+    <w:p>
+      <w:pPr>
+        <w:pStyle w:val="ListBullet"/>
+      </w:pPr>
+      <w:r>
+        <w:t>El admin puede aplicar el mismo descuento a todos los productos de una categoría a la vez, sin editarlos uno por uno.</w:t>
+      </w:r>
+    </w:p>
+    <w:p>
+      <w:pPr>
+        <w:pStyle w:val="ListBullet"/>
+      </w:pPr>
+      <w:r>
+        <w:t>El catálogo y la ficha de producto muestran el precio original tachado junto al precio rebajado, sin acción del cliente.</w:t>
+      </w:r>
+    </w:p>
+    <w:p>
+      <w:pPr>
+        <w:pStyle w:val="ListBullet"/>
+      </w:pPr>
+      <w:r>
+        <w:t>El descuento aplicado es el que se cobra en el checkout (coherente con el precio mostrado).</w:t>
+      </w:r>
+    </w:p>
+    <w:p>
+      <w:pPr>
+        <w:pStyle w:val="ListBullet"/>
+      </w:pPr>
+      <w:r>
+        <w:t>El admin puede quitar el descuento de forma individual o masiva por categoría, restaurando el precio original.</w:t>
+      </w:r>
+    </w:p>
+    <w:p>
+      <w:pPr/>
+      <w:r>
+        <w:rPr>
+          <w:b/>
+          <w:color w:val="0E7A5F"/>
+          <w:sz w:val="19"/>
+        </w:rPr>
+        <w:t>[MCP] Herramienta del servidor MCP</w:t>
+      </w:r>
+    </w:p>
+    <w:tbl>
+      <w:tblPr>
+        <w:tblStyle w:val="TableGrid"/>
+        <w:tblW w:type="auto" w:w="0"/>
+        <w:tblLook w:firstColumn="1" w:firstRow="1" w:lastColumn="0" w:lastRow="0" w:noHBand="0" w:noVBand="1" w:val="04A0"/>
+      </w:tblPr>
+      <w:tblGrid>
+        <w:gridCol w:w="4320"/>
+        <w:gridCol w:w="4320"/>
+      </w:tblGrid>
+      <w:tr>
+        <w:tc>
+          <w:tcPr>
+            <w:tcW w:type="dxa" w:w="4320"/>
+          </w:tcPr>
+          <w:p>
+            <w:r>
+              <w:rPr>
+                <w:b/>
+                <w:sz w:val="19"/>
+              </w:rPr>
+              <w:t>Tool</w:t>
+            </w:r>
+          </w:p>
+        </w:tc>
+        <w:tc>
+          <w:tcPr>
+            <w:tcW w:type="dxa" w:w="4320"/>
+          </w:tcPr>
+          <w:p>
+            <w:r>
+              <w:rPr>
+                <w:sz w:val="19"/>
+              </w:rPr>
+              <w:t>promotions.applyDiscount</w:t>
+            </w:r>
+          </w:p>
+        </w:tc>
+      </w:tr>
+      <w:tr>
+        <w:tc>
+          <w:tcPr>
+            <w:tcW w:type="dxa" w:w="4320"/>
+          </w:tcPr>
+          <w:p>
+            <w:r>
+              <w:rPr>
+                <w:b/>
+                <w:sz w:val="19"/>
+              </w:rPr>
+              <w:t>Autenticación</w:t>
+            </w:r>
+          </w:p>
+        </w:tc>
+        <w:tc>
+          <w:tcPr>
+            <w:tcW w:type="dxa" w:w="4320"/>
+          </w:tcPr>
+          <w:p>
+            <w:r>
+              <w:rPr>
+                <w:sz w:val="19"/>
+              </w:rPr>
+              <w:t>JWT (Clerk) + rol Admin</w:t>
+            </w:r>
+          </w:p>
+        </w:tc>
+      </w:tr>
+      <w:tr>
+        <w:tc>
+          <w:tcPr>
+            <w:tcW w:type="dxa" w:w="4320"/>
+          </w:tcPr>
+          <w:p>
+            <w:r>
+              <w:rPr>
+                <w:b/>
+                <w:sz w:val="19"/>
+              </w:rPr>
+              <w:t>Permite</w:t>
+            </w:r>
+          </w:p>
+        </w:tc>
+        <w:tc>
+          <w:tcPr>
+            <w:tcW w:type="dxa" w:w="4320"/>
+          </w:tcPr>
+          <w:p>
+            <w:r>
+              <w:rPr>
+                <w:sz w:val="19"/>
+              </w:rPr>
+              <w:t>Aplicar o quitar descuentos por producto o categoría para que el agente ejecute campañas de rebajas de forma masiva.</w:t>
             </w:r>
           </w:p>
         </w:tc>

</xml_diff>

<commit_message>
docs: agregar HU-103 (rol owner) al .docx fuente y marcar HU-051 implementada
HU-103 - Rol de administrador supremo (owner): no estaba en el documento
original, surgio en esta sesion al revisar HU-051 (audit trail) - un admin
cualquiera podia cambiarle el rol a cualquier otro, incluida la cuenta duena
del proyecto. Insertada justo despues de HU-051 (mismo modulo, mismo tema de
seguridad/gobernanza), editada directamente con python-docx para no correr
el generador desactualizado (ver nota en seguimiento-hu.md sobre drift).

De paso, HU-051 seguia marcada "Estado: Pendiente" en el .docx pese a estar
mergeada (PR #218) - actualizada a "Implementada".

Nota: el PDF companero (Healthora-Historias-de-Usuario.pdf) no se
regenero - no hay LibreOffice/soffice disponible en este entorno para
exportar. Requiere un re-export manual desde Word si se necesita actualizado.
</commit_message>
<xml_diff>
--- a/deliverables/Healthora-Historias-de-Usuario.docx
+++ b/deliverables/Healthora-Historias-de-Usuario.docx
@@ -20936,7 +20936,7 @@
           <w:color w:val="555555"/>
           <w:sz w:val="18"/>
         </w:rPr>
-        <w:t>Estado: Pendiente   |   Prioridad: Media   |   Módulo: Administración   |   Tipo: Funcional</w:t>
+        <w:t>Estado: Implementada   |   Prioridad: Media   |   Módulo: Administración   |   Tipo: Funcional</w:t>
       </w:r>
     </w:p>
     <w:p>
@@ -21122,6 +21122,56 @@
         </w:tc>
       </w:tr>
     </w:tbl>
+    <w:p>
+      <w:pPr>
+        <w:pStyle w:val="Heading3"/>
+      </w:pPr>
+      <w:r>
+        <w:t>HU-103 - Rol de administrador supremo (owner)</w:t>
+      </w:r>
+    </w:p>
+    <w:p>
+      <w:pPr/>
+      <w:r>
+        <w:t>Estado: Implementada   |   Prioridad: Alta   |   Módulo: Administración   |   Tipo: Funcional</w:t>
+      </w:r>
+    </w:p>
+    <w:p>
+      <w:pPr/>
+      <w:r>
+        <w:t>Historia: Como Administrador dueño del proyecto, quiero un rol de owner que solo yo pueda tener, para controlar quién más tiene acceso de administrador y evitar que cualquier admin pueda modificar esos permisos.</w:t>
+      </w:r>
+    </w:p>
+    <w:p>
+      <w:pPr/>
+      <w:r>
+        <w:t>Criterios de aceptación:</w:t>
+      </w:r>
+    </w:p>
+    <w:p>
+      <w:pPr>
+        <w:pStyle w:val="ListBullet"/>
+      </w:pPr>
+      <w:r>
+        <w:t>Existe un rol owner, superior a admin, asignado a una única cuenta.</w:t>
+      </w:r>
+    </w:p>
+    <w:p>
+      <w:pPr>
+        <w:pStyle w:val="ListBullet"/>
+      </w:pPr>
+      <w:r>
+        <w:t>Solo el owner puede asignar o quitar el rol admin a otros usuarios.</w:t>
+      </w:r>
+    </w:p>
+    <w:p>
+      <w:pPr>
+        <w:pStyle w:val="ListBullet"/>
+      </w:pPr>
+      <w:r>
+        <w:t>El owner no puede ser degradado ni eliminado por ningún otro usuario.</w:t>
+      </w:r>
+    </w:p>
     <w:p>
       <w:pPr>
         <w:pStyle w:val="Heading3"/>

</xml_diff>

<commit_message>
docs: agregar HU-104 (badge de compras del ultimo mes) al .docx fuente
Nueva historia en 3.3 Ecommerce - Descubrimiento, a raiz del issue #224
(estilo Amazon "2K+ bought in past month"). Editada directamente con
python-docx, sin correr el generador desactualizado (scripts/us_data.py).

HU-103 ya estaba tomado (rol owner, PR #223, commit 9415c63), asi que
el issue #224 se renombro de HU-103 a HU-104 para evitar colision de
numeracion.
</commit_message>
<xml_diff>
--- a/deliverables/Healthora-Historias-de-Usuario.docx
+++ b/deliverables/Healthora-Historias-de-Usuario.docx
@@ -20221,6 +20221,65 @@
       </w:pPr>
       <w:r>
         <w:t>El cliente puede quitar productos o pasar uno al carrito desde la comparación.</w:t>
+      </w:r>
+    </w:p>
+    <w:p>
+      <w:pPr>
+        <w:pStyle w:val="Heading3"/>
+      </w:pPr>
+      <w:r>
+        <w:t>HU-104 - Indicador de compras recientes en la ficha de producto (estilo Amazon)</w:t>
+      </w:r>
+    </w:p>
+    <w:p>
+      <w:pPr/>
+      <w:r>
+        <w:t>Estado: Pendiente   |   Prioridad: Baja   |   Módulo: Ecommerce   |   Tipo: Funcional</w:t>
+      </w:r>
+    </w:p>
+    <w:p>
+      <w:pPr/>
+      <w:r>
+        <w:rPr>
+          <w:b/>
+        </w:rPr>
+        <w:t xml:space="preserve">Historia: </w:t>
+      </w:r>
+      <w:r>
+        <w:t>Como Cliente, quiero ver cuántas unidades de un producto se compraron en el último mes, para tener una señal de confianza (prueba social) al decidir mi compra.</w:t>
+      </w:r>
+    </w:p>
+    <w:p>
+      <w:pPr/>
+      <w:r>
+        <w:rPr>
+          <w:b/>
+        </w:rPr>
+        <w:t>Criterios de aceptación:</w:t>
+      </w:r>
+    </w:p>
+    <w:p>
+      <w:pPr>
+        <w:pStyle w:val="ListBullet"/>
+      </w:pPr>
+      <w:r>
+        <w:t>El sistema calcula, por producto, las unidades vendidas en los últimos 30 días a partir de órdenes con pago confirmado.</w:t>
+      </w:r>
+    </w:p>
+    <w:p>
+      <w:pPr>
+        <w:pStyle w:val="ListBullet"/>
+      </w:pPr>
+      <w:r>
+        <w:t>La tarjeta de producto y la ficha muestran un indicador (ej. "500+ compraron el último mes") solo si el conteo supera un umbral mínimo configurado.</w:t>
+      </w:r>
+    </w:p>
+    <w:p>
+      <w:pPr>
+        <w:pStyle w:val="ListBullet"/>
+      </w:pPr>
+      <w:r>
+        <w:t>El conteo se redondea a rangos (10+, 50+, 100+, 1K+...) en vez de mostrar la cifra exacta, siguiendo el mismo criterio de HU-200 (no exponer cantidades exactas de stock).</w:t>
       </w:r>
     </w:p>
     <w:p>

</xml_diff>

<commit_message>
chore: quitar HU-067 (error tracking) y HU-068 (APM) - no funcionales sin actor de negocio
Ambas eran infraestructura de observabilidad (actor DevOps/Plataforma) sin
valor de negocio directo y sin encaje claro en el alcance del proyecto -
generaban secciones "Rendimiento"/"Errores" en el admin sin justificación
funcional real. Se revierte todo lo agregado por PR #107/#108: middleware
de error tracking y métricas de performance, modelos ErrorReport/PerformanceMetric,
endpoints admin, integración PostHog (frontend y backend), y las secciones
correspondientes del panel admin. ErrorBoundary se conserva (compartido con
HU-083, páginas de error) pero ya no reporta a ningún lado.

Actualizado deliverables/Healthora-Historias-de-Usuario.docx y
docs/seguimiento-hu.md para reflejar la remoción. Auditoría (HU-051) no se
toca - es funcional, implementada, con actor Administrador real.

Closes #71, #72
</commit_message>
<xml_diff>
--- a/deliverables/Healthora-Historias-de-Usuario.docx
+++ b/deliverables/Healthora-Historias-de-Usuario.docx
@@ -10737,20 +10737,20 @@
               <w:rPr>
                 <w:sz w:val="19"/>
               </w:rPr>
+              <w:t>2</w:t>
+            </w:r>
+          </w:p>
+        </w:tc>
+        <w:tc>
+          <w:tcPr>
+            <w:tcW w:w="1440" w:type="dxa"/>
+          </w:tcPr>
+          <w:p>
+            <w:r>
+              <w:rPr>
+                <w:sz w:val="19"/>
+              </w:rPr>
               <w:t>4</w:t>
-            </w:r>
-          </w:p>
-        </w:tc>
-        <w:tc>
-          <w:tcPr>
-            <w:tcW w:w="1440" w:type="dxa"/>
-          </w:tcPr>
-          <w:p>
-            <w:r>
-              <w:rPr>
-                <w:sz w:val="19"/>
-              </w:rPr>
-              <w:t>6</w:t>
             </w:r>
           </w:p>
         </w:tc>
@@ -10807,7 +10807,7 @@
               <w:rPr>
                 <w:sz w:val="19"/>
               </w:rPr>
-              <w:t>3</w:t>
+              <w:t>2</w:t>
             </w:r>
           </w:p>
         </w:tc>
@@ -10820,7 +10820,7 @@
               <w:rPr>
                 <w:sz w:val="19"/>
               </w:rPr>
-              <w:t>3</w:t>
+              <w:t>2</w:t>
             </w:r>
           </w:p>
         </w:tc>
@@ -11237,7 +11237,7 @@
                 <w:b/>
                 <w:sz w:val="19"/>
               </w:rPr>
-              <w:t>28</w:t>
+              <w:t>25</w:t>
             </w:r>
           </w:p>
         </w:tc>
@@ -11247,7 +11247,7 @@
           </w:tcPr>
           <w:p>
             <w:r>
-              <w:t>93</w:t>
+              <w:t>90</w:t>
             </w:r>
           </w:p>
         </w:tc>
@@ -23559,21 +23559,21 @@
       <w:pPr>
         <w:pStyle w:val="Heading3"/>
       </w:pPr>
-      <w:bookmarkStart w:id="94" w:name="_Toc234359033"/>
+      <w:bookmarkStart w:id="96" w:name="_Toc234359035"/>
       <w:r>
         <w:rPr>
           <w:rFonts w:ascii="Calibri" w:hAnsi="Calibri"/>
         </w:rPr>
-        <w:t xml:space="preserve">HU-067 - Error tracking con </w:t>
+        <w:t xml:space="preserve">HU-069 - Alertas y monitoreo de </w:t>
       </w:r>
       <w:proofErr w:type="spellStart"/>
       <w:r>
         <w:rPr>
           <w:rFonts w:ascii="Calibri" w:hAnsi="Calibri"/>
         </w:rPr>
-        <w:t>PostHog</w:t>
-      </w:r>
-      <w:bookmarkEnd w:id="94"/>
+        <w:t>uptime</w:t>
+      </w:r>
+      <w:bookmarkEnd w:id="96"/>
       <w:proofErr w:type="spellEnd"/>
     </w:p>
     <w:p>
@@ -23582,7 +23582,7 @@
           <w:color w:val="555555"/>
           <w:sz w:val="18"/>
         </w:rPr>
-        <w:t xml:space="preserve">Estado: Pendiente   |   Prioridad: Alta   |   Módulo: </w:t>
+        <w:t xml:space="preserve">Estado: Pendiente   |   Prioridad: Media   |   Módulo: </w:t>
       </w:r>
       <w:proofErr w:type="spellStart"/>
       <w:r>
@@ -23609,28 +23609,36 @@
         <w:t xml:space="preserve">Historia: </w:t>
       </w:r>
       <w:r>
-        <w:t xml:space="preserve">Como DevOps / Plataforma, quiero capturar errores no controlados en </w:t>
+        <w:t xml:space="preserve">Como DevOps / Plataforma, quiero recibir alertas ante caídas o degradaciones del servicio, para reaccionar rápido y minimizar </w:t>
       </w:r>
       <w:proofErr w:type="spellStart"/>
       <w:r>
-        <w:t>PostHog</w:t>
+        <w:t>perdida</w:t>
       </w:r>
       <w:proofErr w:type="spellEnd"/>
       <w:r>
-        <w:t xml:space="preserve"> (Error Tracking), para detectar y reaccionar a fallos en producción. (Sustituye a </w:t>
+        <w:t xml:space="preserve"> de ingresos.</w:t>
+      </w:r>
+    </w:p>
+    <w:p>
+      <w:r>
+        <w:t>Criterios de aceptación:</w:t>
+      </w:r>
+    </w:p>
+    <w:p>
+      <w:pPr>
+        <w:pStyle w:val="ListBullet"/>
+      </w:pPr>
+      <w:r>
+        <w:t xml:space="preserve">Un monitor externo verifica el </w:t>
       </w:r>
       <w:proofErr w:type="spellStart"/>
       <w:r>
-        <w:t>Sentry</w:t>
+        <w:t>uptime</w:t>
       </w:r>
       <w:proofErr w:type="spellEnd"/>
       <w:r>
-        <w:t>; la consulta de errores se expone en el panel de analítica HU-054.)</w:t>
-      </w:r>
-    </w:p>
-    <w:p>
-      <w:r>
-        <w:t>Criterios de aceptación:</w:t>
+        <w:t xml:space="preserve"> periódicamente.</w:t>
       </w:r>
     </w:p>
     <w:p>
@@ -23638,85 +23646,65 @@
         <w:pStyle w:val="ListBullet"/>
       </w:pPr>
       <w:r>
-        <w:t xml:space="preserve">Las excepciones del </w:t>
+        <w:t>Las caídas generan alertas por canal configurable.</w:t>
+      </w:r>
+    </w:p>
+    <w:p>
+      <w:pPr>
+        <w:pStyle w:val="ListBullet"/>
+      </w:pPr>
+      <w:r>
+        <w:t>Se registra el historial de disponibilidad.</w:t>
+      </w:r>
+    </w:p>
+    <w:p>
+      <w:pPr>
+        <w:pStyle w:val="Heading2"/>
+      </w:pPr>
+      <w:bookmarkStart w:id="97" w:name="_Toc234359036"/>
+      <w:r>
+        <w:rPr>
+          <w:rFonts w:ascii="Calibri" w:hAnsi="Calibri"/>
+        </w:rPr>
+        <w:lastRenderedPageBreak/>
+        <w:t xml:space="preserve">4.3 </w:t>
       </w:r>
       <w:proofErr w:type="spellStart"/>
       <w:r>
-        <w:t>backend</w:t>
-      </w:r>
+        <w:rPr>
+          <w:rFonts w:ascii="Calibri" w:hAnsi="Calibri"/>
+        </w:rPr>
+        <w:t>Testing</w:t>
+      </w:r>
+      <w:bookmarkEnd w:id="97"/>
       <w:proofErr w:type="spellEnd"/>
-      <w:r>
-        <w:t xml:space="preserve"> y </w:t>
+    </w:p>
+    <w:p>
+      <w:pPr>
+        <w:pStyle w:val="Heading3"/>
+      </w:pPr>
+      <w:bookmarkStart w:id="98" w:name="_Toc234359037"/>
+      <w:r>
+        <w:rPr>
+          <w:rFonts w:ascii="Calibri" w:hAnsi="Calibri"/>
+        </w:rPr>
+        <w:t xml:space="preserve">HU-070 - </w:t>
       </w:r>
       <w:proofErr w:type="spellStart"/>
       <w:r>
-        <w:t>frontend</w:t>
+        <w:rPr>
+          <w:rFonts w:ascii="Calibri" w:hAnsi="Calibri"/>
+        </w:rPr>
+        <w:t>Tests</w:t>
       </w:r>
       <w:proofErr w:type="spellEnd"/>
       <w:r>
-        <w:t xml:space="preserve"> se reportan a </w:t>
-      </w:r>
-      <w:proofErr w:type="spellStart"/>
-      <w:r>
-        <w:t>PostHog</w:t>
-      </w:r>
-      <w:proofErr w:type="spellEnd"/>
-      <w:r>
-        <w:t>.</w:t>
-      </w:r>
-    </w:p>
-    <w:p>
-      <w:pPr>
-        <w:pStyle w:val="ListBullet"/>
-      </w:pPr>
-      <w:r>
-        <w:t xml:space="preserve">Cada error incluye </w:t>
-      </w:r>
-      <w:proofErr w:type="spellStart"/>
-      <w:r>
-        <w:t>stack</w:t>
-      </w:r>
-      <w:proofErr w:type="spellEnd"/>
-      <w:r>
-        <w:t xml:space="preserve"> trace y contexto del usuario.</w:t>
-      </w:r>
-    </w:p>
-    <w:p>
-      <w:pPr>
-        <w:pStyle w:val="ListBullet"/>
-      </w:pPr>
-      <w:r>
-        <w:t>Se configuran alertas ante picos de errores.</w:t>
-      </w:r>
-    </w:p>
-    <w:p>
-      <w:pPr>
-        <w:pStyle w:val="ListBullet"/>
-      </w:pPr>
-      <w:r>
-        <w:t xml:space="preserve">Los errores recientes son visibles para el </w:t>
-      </w:r>
-      <w:proofErr w:type="spellStart"/>
-      <w:r>
-        <w:t>admin</w:t>
-      </w:r>
-      <w:proofErr w:type="spellEnd"/>
-      <w:r>
-        <w:t xml:space="preserve"> vía HU-054 (MCP ⊆ UI).</w:t>
-      </w:r>
-    </w:p>
-    <w:p>
-      <w:pPr>
-        <w:pStyle w:val="Heading3"/>
-      </w:pPr>
-      <w:bookmarkStart w:id="95" w:name="_Toc234359034"/>
-      <w:r>
         <w:rPr>
           <w:rFonts w:ascii="Calibri" w:hAnsi="Calibri"/>
         </w:rPr>
-        <w:t>HU-068 - APM y métricas de rendimiento</w:t>
-      </w:r>
-      <w:bookmarkEnd w:id="95"/>
+        <w:t xml:space="preserve"> de integración de flujos críticos</w:t>
+      </w:r>
+      <w:bookmarkEnd w:id="98"/>
     </w:p>
     <w:p>
       <w:r>
@@ -23724,7 +23712,7 @@
           <w:color w:val="555555"/>
           <w:sz w:val="18"/>
         </w:rPr>
-        <w:t xml:space="preserve">Estado: Pendiente   |   Prioridad: Media   |   Módulo: </w:t>
+        <w:t xml:space="preserve">Estado: Pendiente   |   Prioridad: Alta   |   Módulo: </w:t>
       </w:r>
       <w:proofErr w:type="spellStart"/>
       <w:r>
@@ -23732,7 +23720,7 @@
           <w:color w:val="555555"/>
           <w:sz w:val="18"/>
         </w:rPr>
-        <w:t>Observabilidad</w:t>
+        <w:t>Testing</w:t>
       </w:r>
       <w:proofErr w:type="spellEnd"/>
       <w:r>
@@ -23751,44 +23739,92 @@
         <w:t xml:space="preserve">Historia: </w:t>
       </w:r>
       <w:r>
-        <w:t xml:space="preserve">Como DevOps / Plataforma, quiero recolectar métricas de rendimiento de la aplicación (APM), para poder definir y cumplir </w:t>
+        <w:t xml:space="preserve">Como Desarrollador, quiero tener </w:t>
       </w:r>
       <w:proofErr w:type="spellStart"/>
       <w:r>
-        <w:t>SLAs</w:t>
+        <w:t>tests</w:t>
       </w:r>
       <w:proofErr w:type="spellEnd"/>
       <w:r>
+        <w:t xml:space="preserve"> de integración para </w:t>
+      </w:r>
+      <w:proofErr w:type="spellStart"/>
+      <w:r>
+        <w:t>checkout</w:t>
+      </w:r>
+      <w:proofErr w:type="spellEnd"/>
+      <w:r>
+        <w:t xml:space="preserve">, creación de orden y </w:t>
+      </w:r>
+      <w:proofErr w:type="spellStart"/>
+      <w:r>
+        <w:t>webhook</w:t>
+      </w:r>
+      <w:proofErr w:type="spellEnd"/>
+      <w:r>
+        <w:t xml:space="preserve"> de Stripe, para evitar regresiones en los flujos de pago.</w:t>
+      </w:r>
+    </w:p>
+    <w:p>
+      <w:r>
+        <w:t>Criterios de aceptación:</w:t>
+      </w:r>
+    </w:p>
+    <w:p>
+      <w:pPr>
+        <w:pStyle w:val="ListBullet"/>
+      </w:pPr>
+      <w:r>
+        <w:t xml:space="preserve">Existen </w:t>
+      </w:r>
+      <w:proofErr w:type="spellStart"/>
+      <w:r>
+        <w:t>tests</w:t>
+      </w:r>
+      <w:proofErr w:type="spellEnd"/>
+      <w:r>
+        <w:t xml:space="preserve"> de integración del flujo de </w:t>
+      </w:r>
+      <w:proofErr w:type="spellStart"/>
+      <w:r>
+        <w:t>checkout</w:t>
+      </w:r>
+      <w:proofErr w:type="spellEnd"/>
+      <w:r>
         <w:t>.</w:t>
       </w:r>
     </w:p>
     <w:p>
-      <w:r>
-        <w:t>Criterios de aceptación:</w:t>
-      </w:r>
-    </w:p>
-    <w:p>
       <w:pPr>
         <w:pStyle w:val="ListBullet"/>
       </w:pPr>
       <w:r>
-        <w:t xml:space="preserve">Se capturan latencias y </w:t>
+        <w:t xml:space="preserve">Se prueba la creación de orden y el procesamiento del </w:t>
       </w:r>
       <w:proofErr w:type="spellStart"/>
       <w:r>
-        <w:t>throughput</w:t>
+        <w:t>webhook</w:t>
       </w:r>
       <w:proofErr w:type="spellEnd"/>
       <w:r>
-        <w:t xml:space="preserve"> por </w:t>
+        <w:t>.</w:t>
+      </w:r>
+    </w:p>
+    <w:p>
+      <w:pPr>
+        <w:pStyle w:val="ListBullet"/>
+      </w:pPr>
+      <w:r>
+        <w:t xml:space="preserve">Los </w:t>
       </w:r>
       <w:proofErr w:type="spellStart"/>
       <w:r>
-        <w:t>endpoint</w:t>
+        <w:t>tests</w:t>
       </w:r>
       <w:proofErr w:type="spellEnd"/>
       <w:r>
-        <w:t>.</w:t>
+        <w:t xml:space="preserve"> corren contra una base de datos de prueba.</w:t>
       </w:r>
     </w:p>
     <w:p>
@@ -23796,37 +23832,35 @@
         <w:pStyle w:val="ListBullet"/>
       </w:pPr>
       <w:r>
-        <w:t>Las métricas se visualizan en un panel.</w:t>
-      </w:r>
-    </w:p>
-    <w:p>
-      <w:pPr>
-        <w:pStyle w:val="ListBullet"/>
-      </w:pPr>
-      <w:r>
-        <w:t>Se definen umbrales de alerta.</w:t>
+        <w:t>Se ejecutan en el pipeline de CI.</w:t>
       </w:r>
     </w:p>
     <w:p>
       <w:pPr>
         <w:pStyle w:val="Heading3"/>
       </w:pPr>
-      <w:bookmarkStart w:id="96" w:name="_Toc234359035"/>
+      <w:bookmarkStart w:id="99" w:name="_Toc234359038"/>
       <w:r>
         <w:rPr>
           <w:rFonts w:ascii="Calibri" w:hAnsi="Calibri"/>
         </w:rPr>
-        <w:t xml:space="preserve">HU-069 - Alertas y monitoreo de </w:t>
+        <w:t xml:space="preserve">HU-071 - </w:t>
       </w:r>
       <w:proofErr w:type="spellStart"/>
       <w:r>
         <w:rPr>
           <w:rFonts w:ascii="Calibri" w:hAnsi="Calibri"/>
         </w:rPr>
-        <w:t>uptime</w:t>
-      </w:r>
-      <w:bookmarkEnd w:id="96"/>
+        <w:t>Tests</w:t>
+      </w:r>
       <w:proofErr w:type="spellEnd"/>
+      <w:r>
+        <w:rPr>
+          <w:rFonts w:ascii="Calibri" w:hAnsi="Calibri"/>
+        </w:rPr>
+        <w:t xml:space="preserve"> unitarios</w:t>
+      </w:r>
+      <w:bookmarkEnd w:id="99"/>
     </w:p>
     <w:p>
       <w:r>
@@ -23834,7 +23868,7 @@
           <w:color w:val="555555"/>
           <w:sz w:val="18"/>
         </w:rPr>
-        <w:t xml:space="preserve">Estado: Pendiente   |   Prioridad: Media   |   Módulo: </w:t>
+        <w:t xml:space="preserve">Estado: Pendiente   |   Prioridad: Alta   |   Módulo: </w:t>
       </w:r>
       <w:proofErr w:type="spellStart"/>
       <w:r>
@@ -23842,7 +23876,7 @@
           <w:color w:val="555555"/>
           <w:sz w:val="18"/>
         </w:rPr>
-        <w:t>Observabilidad</w:t>
+        <w:t>Testing</w:t>
       </w:r>
       <w:proofErr w:type="spellEnd"/>
       <w:r>
@@ -23861,15 +23895,15 @@
         <w:t xml:space="preserve">Historia: </w:t>
       </w:r>
       <w:r>
-        <w:t xml:space="preserve">Como DevOps / Plataforma, quiero recibir alertas ante caídas o degradaciones del servicio, para reaccionar rápido y minimizar </w:t>
+        <w:t xml:space="preserve">Como Desarrollador, quiero contar con </w:t>
       </w:r>
       <w:proofErr w:type="spellStart"/>
       <w:r>
-        <w:t>perdida</w:t>
+        <w:t>tests</w:t>
       </w:r>
       <w:proofErr w:type="spellEnd"/>
       <w:r>
-        <w:t xml:space="preserve"> de ingresos.</w:t>
+        <w:t xml:space="preserve"> unitarios de la lógica de negocio, para tener confianza al refactorizar.</w:t>
       </w:r>
     </w:p>
     <w:p>
@@ -23882,15 +23916,15 @@
         <w:pStyle w:val="ListBullet"/>
       </w:pPr>
       <w:r>
-        <w:t xml:space="preserve">Un monitor externo verifica el </w:t>
+        <w:t xml:space="preserve">La lógica crítica (precios, descuentos, estados) tiene </w:t>
       </w:r>
       <w:proofErr w:type="spellStart"/>
       <w:r>
-        <w:t>uptime</w:t>
+        <w:t>tests</w:t>
       </w:r>
       <w:proofErr w:type="spellEnd"/>
       <w:r>
-        <w:t xml:space="preserve"> periódicamente.</w:t>
+        <w:t xml:space="preserve"> unitarios.</w:t>
       </w:r>
     </w:p>
     <w:p>
@@ -23898,7 +23932,15 @@
         <w:pStyle w:val="ListBullet"/>
       </w:pPr>
       <w:r>
-        <w:t>Las caídas generan alertas por canal configurable.</w:t>
+        <w:t xml:space="preserve">Los </w:t>
+      </w:r>
+      <w:proofErr w:type="spellStart"/>
+      <w:r>
+        <w:t>tests</w:t>
+      </w:r>
+      <w:proofErr w:type="spellEnd"/>
+      <w:r>
+        <w:t xml:space="preserve"> corren con el runner de Bun.</w:t>
       </w:r>
     </w:p>
     <w:p>
@@ -23906,57 +23948,25 @@
         <w:pStyle w:val="ListBullet"/>
       </w:pPr>
       <w:r>
-        <w:t>Se registra el historial de disponibilidad.</w:t>
-      </w:r>
-    </w:p>
-    <w:p>
-      <w:pPr>
-        <w:pStyle w:val="Heading2"/>
-      </w:pPr>
-      <w:bookmarkStart w:id="97" w:name="_Toc234359036"/>
+        <w:t>Se mide la cobertura de código.</w:t>
+      </w:r>
+    </w:p>
+    <w:p>
+      <w:pPr>
+        <w:pStyle w:val="Heading3"/>
+        <w:rPr>
+          <w:lang w:val="en-US"/>
+        </w:rPr>
+      </w:pPr>
+      <w:bookmarkStart w:id="100" w:name="_Toc234359039"/>
       <w:r>
         <w:rPr>
           <w:rFonts w:ascii="Calibri" w:hAnsi="Calibri"/>
-        </w:rPr>
-        <w:lastRenderedPageBreak/>
-        <w:t xml:space="preserve">4.3 </w:t>
-      </w:r>
-      <w:proofErr w:type="spellStart"/>
-      <w:r>
-        <w:rPr>
-          <w:rFonts w:ascii="Calibri" w:hAnsi="Calibri"/>
-        </w:rPr>
-        <w:t>Testing</w:t>
-      </w:r>
-      <w:bookmarkEnd w:id="97"/>
-      <w:proofErr w:type="spellEnd"/>
-    </w:p>
-    <w:p>
-      <w:pPr>
-        <w:pStyle w:val="Heading3"/>
-      </w:pPr>
-      <w:bookmarkStart w:id="98" w:name="_Toc234359037"/>
-      <w:r>
-        <w:rPr>
-          <w:rFonts w:ascii="Calibri" w:hAnsi="Calibri"/>
-        </w:rPr>
-        <w:t xml:space="preserve">HU-070 - </w:t>
-      </w:r>
-      <w:proofErr w:type="spellStart"/>
-      <w:r>
-        <w:rPr>
-          <w:rFonts w:ascii="Calibri" w:hAnsi="Calibri"/>
-        </w:rPr>
-        <w:t>Tests</w:t>
-      </w:r>
-      <w:proofErr w:type="spellEnd"/>
-      <w:r>
-        <w:rPr>
-          <w:rFonts w:ascii="Calibri" w:hAnsi="Calibri"/>
-        </w:rPr>
-        <w:t xml:space="preserve"> de integración de flujos críticos</w:t>
-      </w:r>
-      <w:bookmarkEnd w:id="98"/>
+          <w:lang w:val="en-US"/>
+        </w:rPr>
+        <w:t>HU-072 - Tests end-to-end (Playwright)</w:t>
+      </w:r>
+      <w:bookmarkEnd w:id="100"/>
     </w:p>
     <w:p>
       <w:r>
@@ -23999,23 +24009,23 @@
       </w:r>
       <w:proofErr w:type="spellEnd"/>
       <w:r>
-        <w:t xml:space="preserve"> de integración para </w:t>
+        <w:t xml:space="preserve"> E2E del flujo de compra con </w:t>
       </w:r>
       <w:proofErr w:type="spellStart"/>
       <w:r>
-        <w:t>checkout</w:t>
+        <w:t>Playwright</w:t>
       </w:r>
       <w:proofErr w:type="spellEnd"/>
       <w:r>
-        <w:t xml:space="preserve">, creación de orden y </w:t>
+        <w:t xml:space="preserve">, para refactorizar con seguridad y validar el </w:t>
       </w:r>
       <w:proofErr w:type="spellStart"/>
       <w:r>
-        <w:t>webhook</w:t>
+        <w:t>journey</w:t>
       </w:r>
       <w:proofErr w:type="spellEnd"/>
       <w:r>
-        <w:t xml:space="preserve"> de Stripe, para evitar regresiones en los flujos de pago.</w:t>
+        <w:t xml:space="preserve"> completo.</w:t>
       </w:r>
     </w:p>
     <w:p>
@@ -24028,7 +24038,23 @@
         <w:pStyle w:val="ListBullet"/>
       </w:pPr>
       <w:r>
-        <w:t xml:space="preserve">Existen </w:t>
+        <w:t xml:space="preserve">Existe </w:t>
+      </w:r>
+      <w:proofErr w:type="gramStart"/>
+      <w:r>
+        <w:t>un test</w:t>
+      </w:r>
+      <w:proofErr w:type="gramEnd"/>
+      <w:r>
+        <w:t xml:space="preserve"> E2E del flujo completo de compra.</w:t>
+      </w:r>
+    </w:p>
+    <w:p>
+      <w:pPr>
+        <w:pStyle w:val="ListBullet"/>
+      </w:pPr>
+      <w:r>
+        <w:t xml:space="preserve">Los </w:t>
       </w:r>
       <w:proofErr w:type="spellStart"/>
       <w:r>
@@ -24036,11 +24062,11 @@
       </w:r>
       <w:proofErr w:type="spellEnd"/>
       <w:r>
-        <w:t xml:space="preserve"> de integración del flujo de </w:t>
+        <w:t xml:space="preserve"> E2E corren en CI de forma </w:t>
       </w:r>
       <w:proofErr w:type="spellStart"/>
       <w:r>
-        <w:t>checkout</w:t>
+        <w:t>headless</w:t>
       </w:r>
       <w:proofErr w:type="spellEnd"/>
       <w:r>
@@ -24052,67 +24078,48 @@
         <w:pStyle w:val="ListBullet"/>
       </w:pPr>
       <w:r>
-        <w:t xml:space="preserve">Se prueba la creación de orden y el procesamiento del </w:t>
+        <w:t>Se cubren los caminos felices y al menos un error.</w:t>
+      </w:r>
+    </w:p>
+    <w:p>
+      <w:pPr>
+        <w:pStyle w:val="Heading2"/>
+      </w:pPr>
+      <w:bookmarkStart w:id="101" w:name="_Toc234359040"/>
+      <w:r>
+        <w:rPr>
+          <w:rFonts w:ascii="Calibri" w:hAnsi="Calibri"/>
+        </w:rPr>
+        <w:t>4.4 DevOps</w:t>
+      </w:r>
+      <w:bookmarkEnd w:id="101"/>
+    </w:p>
+    <w:p>
+      <w:pPr>
+        <w:pStyle w:val="Heading3"/>
+      </w:pPr>
+      <w:bookmarkStart w:id="102" w:name="_Toc234359041"/>
+      <w:r>
+        <w:rPr>
+          <w:rFonts w:ascii="Calibri" w:hAnsi="Calibri"/>
+        </w:rPr>
+        <w:t xml:space="preserve">HU-073 - </w:t>
       </w:r>
       <w:proofErr w:type="spellStart"/>
       <w:r>
-        <w:t>webhook</w:t>
+        <w:rPr>
+          <w:rFonts w:ascii="Calibri" w:hAnsi="Calibri"/>
+        </w:rPr>
+        <w:t>Containerización</w:t>
       </w:r>
       <w:proofErr w:type="spellEnd"/>
       <w:r>
-        <w:t>.</w:t>
-      </w:r>
-    </w:p>
-    <w:p>
-      <w:pPr>
-        <w:pStyle w:val="ListBullet"/>
-      </w:pPr>
-      <w:r>
-        <w:t xml:space="preserve">Los </w:t>
-      </w:r>
-      <w:proofErr w:type="spellStart"/>
-      <w:r>
-        <w:t>tests</w:t>
-      </w:r>
-      <w:proofErr w:type="spellEnd"/>
-      <w:r>
-        <w:t xml:space="preserve"> corren contra una base de datos de prueba.</w:t>
-      </w:r>
-    </w:p>
-    <w:p>
-      <w:pPr>
-        <w:pStyle w:val="ListBullet"/>
-      </w:pPr>
-      <w:r>
-        <w:t>Se ejecutan en el pipeline de CI.</w:t>
-      </w:r>
-    </w:p>
-    <w:p>
-      <w:pPr>
-        <w:pStyle w:val="Heading3"/>
-      </w:pPr>
-      <w:bookmarkStart w:id="99" w:name="_Toc234359038"/>
-      <w:r>
         <w:rPr>
           <w:rFonts w:ascii="Calibri" w:hAnsi="Calibri"/>
         </w:rPr>
-        <w:t xml:space="preserve">HU-071 - </w:t>
-      </w:r>
-      <w:proofErr w:type="spellStart"/>
-      <w:r>
-        <w:rPr>
-          <w:rFonts w:ascii="Calibri" w:hAnsi="Calibri"/>
-        </w:rPr>
-        <w:t>Tests</w:t>
-      </w:r>
-      <w:proofErr w:type="spellEnd"/>
-      <w:r>
-        <w:rPr>
-          <w:rFonts w:ascii="Calibri" w:hAnsi="Calibri"/>
-        </w:rPr>
-        <w:t xml:space="preserve"> unitarios</w:t>
-      </w:r>
-      <w:bookmarkEnd w:id="99"/>
+        <w:t xml:space="preserve"> y CI/CD</w:t>
+      </w:r>
+      <w:bookmarkEnd w:id="102"/>
     </w:p>
     <w:p>
       <w:r>
@@ -24120,23 +24127,240 @@
           <w:color w:val="555555"/>
           <w:sz w:val="18"/>
         </w:rPr>
-        <w:t xml:space="preserve">Estado: Pendiente   |   Prioridad: Alta   |   Módulo: </w:t>
+        <w:t>Estado: Pendiente   |   Prioridad: Alta   |   Módulo: DevOps   |   Tipo: No funcional</w:t>
+      </w:r>
+    </w:p>
+    <w:p>
+      <w:r>
+        <w:rPr>
+          <w:b/>
+        </w:rPr>
+        <w:t xml:space="preserve">Historia: </w:t>
+      </w:r>
+      <w:r>
+        <w:t xml:space="preserve">Como DevOps / Plataforma, quiero disponer de </w:t>
       </w:r>
       <w:proofErr w:type="spellStart"/>
+      <w:r>
+        <w:t>Dockerfile</w:t>
+      </w:r>
+      <w:proofErr w:type="spellEnd"/>
+      <w:r>
+        <w:t xml:space="preserve"> y un pipeline de CI/CD (GitHub </w:t>
+      </w:r>
+      <w:proofErr w:type="spellStart"/>
+      <w:r>
+        <w:t>Actions</w:t>
+      </w:r>
+      <w:proofErr w:type="spellEnd"/>
+      <w:r>
+        <w:t>), para lograr despliegues reproducibles y sin error humano.</w:t>
+      </w:r>
+    </w:p>
+    <w:p>
+      <w:r>
+        <w:lastRenderedPageBreak/>
+        <w:t>Criterios de aceptación:</w:t>
+      </w:r>
+    </w:p>
+    <w:p>
+      <w:pPr>
+        <w:pStyle w:val="ListBullet"/>
+      </w:pPr>
+      <w:r>
+        <w:t xml:space="preserve">Existe un </w:t>
+      </w:r>
+      <w:proofErr w:type="spellStart"/>
+      <w:r>
+        <w:t>Dockerfile</w:t>
+      </w:r>
+      <w:proofErr w:type="spellEnd"/>
+      <w:r>
+        <w:t xml:space="preserve"> que construye la aplicación.</w:t>
+      </w:r>
+    </w:p>
+    <w:p>
+      <w:pPr>
+        <w:pStyle w:val="ListBullet"/>
+      </w:pPr>
+      <w:r>
+        <w:t xml:space="preserve">El pipeline ejecuta </w:t>
+      </w:r>
+      <w:proofErr w:type="spellStart"/>
+      <w:r>
+        <w:t>build</w:t>
+      </w:r>
+      <w:proofErr w:type="spellEnd"/>
+      <w:r>
+        <w:t xml:space="preserve">, </w:t>
+      </w:r>
+      <w:proofErr w:type="spellStart"/>
+      <w:r>
+        <w:t>lint</w:t>
+      </w:r>
+      <w:proofErr w:type="spellEnd"/>
+      <w:r>
+        <w:t xml:space="preserve"> y </w:t>
+      </w:r>
+      <w:proofErr w:type="spellStart"/>
+      <w:r>
+        <w:t>tests</w:t>
+      </w:r>
+      <w:proofErr w:type="spellEnd"/>
+      <w:r>
+        <w:t xml:space="preserve"> en cada </w:t>
+      </w:r>
+      <w:proofErr w:type="spellStart"/>
+      <w:r>
+        <w:t>push</w:t>
+      </w:r>
+      <w:proofErr w:type="spellEnd"/>
+      <w:r>
+        <w:t>.</w:t>
+      </w:r>
+    </w:p>
+    <w:p>
+      <w:pPr>
+        <w:pStyle w:val="ListBullet"/>
+      </w:pPr>
+      <w:r>
+        <w:t>El despliegue se automatiza tras pasar el pipeline.</w:t>
+      </w:r>
+    </w:p>
+    <w:p>
+      <w:pPr>
+        <w:pStyle w:val="Heading3"/>
+      </w:pPr>
+      <w:bookmarkStart w:id="103" w:name="_Toc234359042"/>
+      <w:r>
+        <w:rPr>
+          <w:rFonts w:ascii="Calibri" w:hAnsi="Calibri"/>
+        </w:rPr>
+        <w:t xml:space="preserve">HU-074 - </w:t>
+      </w:r>
+      <w:proofErr w:type="spellStart"/>
+      <w:r>
+        <w:rPr>
+          <w:rFonts w:ascii="Calibri" w:hAnsi="Calibri"/>
+        </w:rPr>
+        <w:t>Backups</w:t>
+      </w:r>
+      <w:proofErr w:type="spellEnd"/>
+      <w:r>
+        <w:rPr>
+          <w:rFonts w:ascii="Calibri" w:hAnsi="Calibri"/>
+        </w:rPr>
+        <w:t xml:space="preserve"> automatizados de MongoDB Atlas</w:t>
+      </w:r>
+      <w:bookmarkEnd w:id="103"/>
+    </w:p>
+    <w:p>
       <w:r>
         <w:rPr>
           <w:color w:val="555555"/>
           <w:sz w:val="18"/>
         </w:rPr>
-        <w:t>Testing</w:t>
+        <w:t>Estado: Pendiente   |   Prioridad: Alta   |   Módulo: DevOps   |   Tipo: No funcional</w:t>
+      </w:r>
+    </w:p>
+    <w:p>
+      <w:r>
+        <w:rPr>
+          <w:b/>
+        </w:rPr>
+        <w:t xml:space="preserve">Historia: </w:t>
+      </w:r>
+      <w:r>
+        <w:t xml:space="preserve">Como DevOps / Plataforma, quiero contar con </w:t>
+      </w:r>
+      <w:proofErr w:type="spellStart"/>
+      <w:r>
+        <w:t>backups</w:t>
       </w:r>
       <w:proofErr w:type="spellEnd"/>
+      <w:r>
+        <w:t xml:space="preserve"> automáticos y restaurables de la base de datos, para recuperar la información ante una </w:t>
+      </w:r>
+      <w:proofErr w:type="spellStart"/>
+      <w:r>
+        <w:t>perdida</w:t>
+      </w:r>
+      <w:proofErr w:type="spellEnd"/>
+      <w:r>
+        <w:t xml:space="preserve"> de datos.</w:t>
+      </w:r>
+    </w:p>
+    <w:p>
+      <w:r>
+        <w:t>Criterios de aceptación:</w:t>
+      </w:r>
+    </w:p>
+    <w:p>
+      <w:pPr>
+        <w:pStyle w:val="ListBullet"/>
+      </w:pPr>
+      <w:r>
+        <w:t xml:space="preserve">Los </w:t>
+      </w:r>
+      <w:proofErr w:type="spellStart"/>
+      <w:r>
+        <w:t>backups</w:t>
+      </w:r>
+      <w:proofErr w:type="spellEnd"/>
+      <w:r>
+        <w:t xml:space="preserve"> se ejecutan de forma automática y periódica.</w:t>
+      </w:r>
+    </w:p>
+    <w:p>
+      <w:pPr>
+        <w:pStyle w:val="ListBullet"/>
+      </w:pPr>
+      <w:r>
+        <w:t>Se valida la restauración en un entorno de prueba.</w:t>
+      </w:r>
+    </w:p>
+    <w:p>
+      <w:pPr>
+        <w:pStyle w:val="ListBullet"/>
+      </w:pPr>
+      <w:r>
+        <w:t>Se define una política de retención.</w:t>
+      </w:r>
+    </w:p>
+    <w:p>
+      <w:pPr>
+        <w:pStyle w:val="Heading3"/>
+      </w:pPr>
+      <w:bookmarkStart w:id="104" w:name="_Toc234359043"/>
+      <w:r>
+        <w:rPr>
+          <w:rFonts w:ascii="Calibri" w:hAnsi="Calibri"/>
+        </w:rPr>
+        <w:t xml:space="preserve">HU-075 - Ambiente de </w:t>
+      </w:r>
+      <w:proofErr w:type="spellStart"/>
+      <w:r>
+        <w:rPr>
+          <w:rFonts w:ascii="Calibri" w:hAnsi="Calibri"/>
+        </w:rPr>
+        <w:t>staging</w:t>
+      </w:r>
+      <w:proofErr w:type="spellEnd"/>
+      <w:r>
+        <w:rPr>
+          <w:rFonts w:ascii="Calibri" w:hAnsi="Calibri"/>
+        </w:rPr>
+        <w:t xml:space="preserve"> separado</w:t>
+      </w:r>
+      <w:bookmarkEnd w:id="104"/>
+    </w:p>
+    <w:p>
       <w:r>
         <w:rPr>
           <w:color w:val="555555"/>
           <w:sz w:val="18"/>
         </w:rPr>
-        <w:t xml:space="preserve">   |   Tipo: No funcional</w:t>
+        <w:t>Estado: Pendiente   |   Prioridad: Alta   |   Módulo: DevOps   |   Tipo: No funcional</w:t>
       </w:r>
     </w:p>
     <w:p>
@@ -24147,15 +24371,15 @@
         <w:t xml:space="preserve">Historia: </w:t>
       </w:r>
       <w:r>
-        <w:t xml:space="preserve">Como Desarrollador, quiero contar con </w:t>
+        <w:t xml:space="preserve">Como DevOps / Plataforma, quiero disponer de un entorno de </w:t>
       </w:r>
       <w:proofErr w:type="spellStart"/>
       <w:r>
-        <w:t>tests</w:t>
+        <w:t>staging</w:t>
       </w:r>
       <w:proofErr w:type="spellEnd"/>
       <w:r>
-        <w:t xml:space="preserve"> unitarios de la lógica de negocio, para tener confianza al refactorizar.</w:t>
+        <w:t xml:space="preserve"> separado de producción, para probar cambios antes de liberarlos a clientes.</w:t>
       </w:r>
     </w:p>
     <w:p>
@@ -24168,15 +24392,15 @@
         <w:pStyle w:val="ListBullet"/>
       </w:pPr>
       <w:r>
-        <w:t xml:space="preserve">La lógica crítica (precios, descuentos, estados) tiene </w:t>
+        <w:t xml:space="preserve">Existe un entorno </w:t>
       </w:r>
       <w:proofErr w:type="spellStart"/>
       <w:r>
-        <w:t>tests</w:t>
+        <w:t>staging</w:t>
       </w:r>
       <w:proofErr w:type="spellEnd"/>
       <w:r>
-        <w:t xml:space="preserve"> unitarios.</w:t>
+        <w:t xml:space="preserve"> con datos no productivos.</w:t>
       </w:r>
     </w:p>
     <w:p>
@@ -24184,41 +24408,50 @@
         <w:pStyle w:val="ListBullet"/>
       </w:pPr>
       <w:r>
-        <w:t xml:space="preserve">Los </w:t>
+        <w:t xml:space="preserve">El pipeline despliega a </w:t>
       </w:r>
       <w:proofErr w:type="spellStart"/>
       <w:r>
-        <w:t>tests</w:t>
+        <w:t>staging</w:t>
       </w:r>
       <w:proofErr w:type="spellEnd"/>
       <w:r>
-        <w:t xml:space="preserve"> corren con el runner de Bun.</w:t>
+        <w:t xml:space="preserve"> antes que a producción.</w:t>
       </w:r>
     </w:p>
     <w:p>
       <w:pPr>
         <w:pStyle w:val="ListBullet"/>
       </w:pPr>
-      <w:r>
-        <w:t>Se mide la cobertura de código.</w:t>
+      <w:proofErr w:type="spellStart"/>
+      <w:r>
+        <w:t>Staging</w:t>
+      </w:r>
+      <w:proofErr w:type="spellEnd"/>
+      <w:r>
+        <w:t xml:space="preserve"> replica la configuración de producción.</w:t>
       </w:r>
     </w:p>
     <w:p>
       <w:pPr>
         <w:pStyle w:val="Heading3"/>
-        <w:rPr>
-          <w:lang w:val="en-US"/>
-        </w:rPr>
-      </w:pPr>
-      <w:bookmarkStart w:id="100" w:name="_Toc234359039"/>
+      </w:pPr>
+      <w:bookmarkStart w:id="105" w:name="_Toc234359044"/>
       <w:r>
         <w:rPr>
           <w:rFonts w:ascii="Calibri" w:hAnsi="Calibri"/>
-          <w:lang w:val="en-US"/>
-        </w:rPr>
-        <w:t>HU-072 - Tests end-to-end (Playwright)</w:t>
-      </w:r>
-      <w:bookmarkEnd w:id="100"/>
+        </w:rPr>
+        <w:t xml:space="preserve">HU-076 - Estrategia de </w:t>
+      </w:r>
+      <w:proofErr w:type="spellStart"/>
+      <w:r>
+        <w:rPr>
+          <w:rFonts w:ascii="Calibri" w:hAnsi="Calibri"/>
+        </w:rPr>
+        <w:t>rollback</w:t>
+      </w:r>
+      <w:bookmarkEnd w:id="105"/>
+      <w:proofErr w:type="spellEnd"/>
     </w:p>
     <w:p>
       <w:r>
@@ -24226,23 +24459,167 @@
           <w:color w:val="555555"/>
           <w:sz w:val="18"/>
         </w:rPr>
-        <w:t xml:space="preserve">Estado: Pendiente   |   Prioridad: Alta   |   Módulo: </w:t>
+        <w:t>Estado: Pendiente   |   Prioridad: Media   |   Módulo: DevOps   |   Tipo: No funcional</w:t>
+      </w:r>
+    </w:p>
+    <w:p>
+      <w:r>
+        <w:rPr>
+          <w:b/>
+        </w:rPr>
+        <w:t xml:space="preserve">Historia: </w:t>
+      </w:r>
+      <w:r>
+        <w:t>Como DevOps / Plataforma, quiero poder revertir rápidamente un despliegue defectuoso, para mitigar el impacto de un bug crítico.</w:t>
+      </w:r>
+    </w:p>
+    <w:p>
+      <w:r>
+        <w:t>Criterios de aceptación:</w:t>
+      </w:r>
+    </w:p>
+    <w:p>
+      <w:pPr>
+        <w:pStyle w:val="ListBullet"/>
+      </w:pPr>
+      <w:r>
+        <w:t>El sistema permite volver a la versión anterior con un paso.</w:t>
+      </w:r>
+    </w:p>
+    <w:p>
+      <w:pPr>
+        <w:pStyle w:val="ListBullet"/>
+      </w:pPr>
+      <w:r>
+        <w:t xml:space="preserve">El </w:t>
       </w:r>
       <w:proofErr w:type="spellStart"/>
+      <w:r>
+        <w:t>rollback</w:t>
+      </w:r>
+      <w:proofErr w:type="spellEnd"/>
+      <w:r>
+        <w:t xml:space="preserve"> está documentado y probado.</w:t>
+      </w:r>
+    </w:p>
+    <w:p>
+      <w:pPr>
+        <w:pStyle w:val="ListBullet"/>
+      </w:pPr>
+      <w:r>
+        <w:t>Las migraciones de datos son compatibles hacia atrás cuando es posible.</w:t>
+      </w:r>
+    </w:p>
+    <w:p>
+      <w:pPr>
+        <w:pStyle w:val="Heading2"/>
+      </w:pPr>
+      <w:bookmarkStart w:id="106" w:name="_Toc234359045"/>
+      <w:r>
+        <w:rPr>
+          <w:rFonts w:ascii="Calibri" w:hAnsi="Calibri"/>
+        </w:rPr>
+        <w:t>4.5 Escalabilidad</w:t>
+      </w:r>
+      <w:bookmarkEnd w:id="106"/>
+    </w:p>
+    <w:p>
+      <w:pPr>
+        <w:pStyle w:val="Heading3"/>
+      </w:pPr>
+      <w:bookmarkStart w:id="107" w:name="_Toc234359046"/>
+      <w:r>
+        <w:rPr>
+          <w:rFonts w:ascii="Calibri" w:hAnsi="Calibri"/>
+        </w:rPr>
+        <w:t>HU-077 - Cache de catálogo con Redis</w:t>
+      </w:r>
+      <w:bookmarkEnd w:id="107"/>
+    </w:p>
+    <w:p>
       <w:r>
         <w:rPr>
           <w:color w:val="555555"/>
           <w:sz w:val="18"/>
         </w:rPr>
-        <w:t>Testing</w:t>
+        <w:t>Estado: Pendiente   |   Prioridad: Media   |   Módulo: Escalabilidad   |   Tipo: No funcional</w:t>
+      </w:r>
+    </w:p>
+    <w:p>
+      <w:r>
+        <w:rPr>
+          <w:b/>
+        </w:rPr>
+        <w:lastRenderedPageBreak/>
+        <w:t xml:space="preserve">Historia: </w:t>
+      </w:r>
+      <w:r>
+        <w:t>Como Sistema, quiero cachear las respuestas del catálogo en Redis, para reducir los accesos a la base de datos y mejorar el rendimiento.</w:t>
+      </w:r>
+    </w:p>
+    <w:p>
+      <w:r>
+        <w:t>Criterios de aceptación:</w:t>
+      </w:r>
+    </w:p>
+    <w:p>
+      <w:pPr>
+        <w:pStyle w:val="ListBullet"/>
+      </w:pPr>
+      <w:r>
+        <w:t>Las consultas de catálogo frecuentes se sirven desde cache.</w:t>
+      </w:r>
+    </w:p>
+    <w:p>
+      <w:pPr>
+        <w:pStyle w:val="ListBullet"/>
+      </w:pPr>
+      <w:r>
+        <w:t>La cache se invalida al actualizar productos.</w:t>
+      </w:r>
+    </w:p>
+    <w:p>
+      <w:pPr>
+        <w:pStyle w:val="ListBullet"/>
+      </w:pPr>
+      <w:r>
+        <w:t>Se define un TTL adecuado.</w:t>
+      </w:r>
+    </w:p>
+    <w:p>
+      <w:pPr>
+        <w:pStyle w:val="Heading3"/>
+      </w:pPr>
+      <w:bookmarkStart w:id="108" w:name="_Toc234359047"/>
+      <w:r>
+        <w:rPr>
+          <w:rFonts w:ascii="Calibri" w:hAnsi="Calibri"/>
+        </w:rPr>
+        <w:t xml:space="preserve">HU-078 - Entrega de imágenes vía </w:t>
+      </w:r>
+      <w:proofErr w:type="spellStart"/>
+      <w:r>
+        <w:rPr>
+          <w:rFonts w:ascii="Calibri" w:hAnsi="Calibri"/>
+        </w:rPr>
+        <w:t>Cloudinary</w:t>
       </w:r>
       <w:proofErr w:type="spellEnd"/>
+      <w:r>
+        <w:rPr>
+          <w:rFonts w:ascii="Calibri" w:hAnsi="Calibri"/>
+        </w:rPr>
+        <w:t xml:space="preserve"> (CDN)</w:t>
+      </w:r>
+      <w:bookmarkEnd w:id="108"/>
+    </w:p>
+    <w:p>
       <w:r>
         <w:rPr>
           <w:color w:val="555555"/>
           <w:sz w:val="18"/>
         </w:rPr>
-        <w:t xml:space="preserve">   |   Tipo: No funcional</w:t>
+        <w:t>Estado: Pendiente   |   Prioridad: Alta   |   Módulo: Escalabilidad   |   Tipo: No funcional</w:t>
       </w:r>
     </w:p>
     <w:p>
@@ -24253,36 +24630,76 @@
         <w:t xml:space="preserve">Historia: </w:t>
       </w:r>
       <w:r>
-        <w:t xml:space="preserve">Como Desarrollador, quiero tener </w:t>
+        <w:t xml:space="preserve">Como Sistema, quiero almacenar y servir las imágenes de productos a través de </w:t>
       </w:r>
       <w:proofErr w:type="spellStart"/>
       <w:r>
-        <w:t>tests</w:t>
+        <w:t>Cloudinary</w:t>
       </w:r>
       <w:proofErr w:type="spellEnd"/>
       <w:r>
-        <w:t xml:space="preserve"> E2E del flujo de compra con </w:t>
+        <w:t>, para escalar la entrega con su CDN global y reducir latencia sin gestionar infraestructura propia.</w:t>
+      </w:r>
+    </w:p>
+    <w:p>
+      <w:r>
+        <w:t>Criterios de aceptación:</w:t>
+      </w:r>
+    </w:p>
+    <w:p>
+      <w:pPr>
+        <w:pStyle w:val="ListBullet"/>
+      </w:pPr>
+      <w:r>
+        <w:t xml:space="preserve">Las imágenes se almacenan y sirven desde </w:t>
       </w:r>
       <w:proofErr w:type="spellStart"/>
       <w:r>
-        <w:t>Playwright</w:t>
+        <w:t>Cloudinary</w:t>
       </w:r>
       <w:proofErr w:type="spellEnd"/>
       <w:r>
-        <w:t xml:space="preserve">, para refactorizar con seguridad y validar el </w:t>
+        <w:t xml:space="preserve"> (CDN), no desde el servidor de la </w:t>
+      </w:r>
+      <w:proofErr w:type="gramStart"/>
+      <w:r>
+        <w:t>app</w:t>
+      </w:r>
+      <w:proofErr w:type="gramEnd"/>
+      <w:r>
+        <w:t>.</w:t>
+      </w:r>
+    </w:p>
+    <w:p>
+      <w:pPr>
+        <w:pStyle w:val="ListBullet"/>
+      </w:pPr>
+      <w:r>
+        <w:t xml:space="preserve">Las </w:t>
       </w:r>
       <w:proofErr w:type="spellStart"/>
       <w:r>
-        <w:t>journey</w:t>
+        <w:t>URLs</w:t>
       </w:r>
       <w:proofErr w:type="spellEnd"/>
       <w:r>
-        <w:t xml:space="preserve"> completo.</w:t>
-      </w:r>
-    </w:p>
-    <w:p>
-      <w:r>
-        <w:t>Criterios de aceptación:</w:t>
+        <w:t xml:space="preserve"> apuntan a </w:t>
+      </w:r>
+      <w:proofErr w:type="spellStart"/>
+      <w:r>
+        <w:t>Cloudinary</w:t>
+      </w:r>
+      <w:proofErr w:type="spellEnd"/>
+      <w:r>
+        <w:t xml:space="preserve"> con transformaciones (</w:t>
+      </w:r>
+      <w:proofErr w:type="spellStart"/>
+      <w:r>
+        <w:t>resize</w:t>
+      </w:r>
+      <w:proofErr w:type="spellEnd"/>
+      <w:r>
+        <w:t>, recorte, formato) bajo demanda.</w:t>
       </w:r>
     </w:p>
     <w:p>
@@ -24290,754 +24707,7 @@
         <w:pStyle w:val="ListBullet"/>
       </w:pPr>
       <w:r>
-        <w:t xml:space="preserve">Existe </w:t>
-      </w:r>
-      <w:proofErr w:type="gramStart"/>
-      <w:r>
-        <w:t>un test</w:t>
-      </w:r>
-      <w:proofErr w:type="gramEnd"/>
-      <w:r>
-        <w:t xml:space="preserve"> E2E del flujo completo de compra.</w:t>
-      </w:r>
-    </w:p>
-    <w:p>
-      <w:pPr>
-        <w:pStyle w:val="ListBullet"/>
-      </w:pPr>
-      <w:r>
-        <w:t xml:space="preserve">Los </w:t>
-      </w:r>
-      <w:proofErr w:type="spellStart"/>
-      <w:r>
-        <w:t>tests</w:t>
-      </w:r>
-      <w:proofErr w:type="spellEnd"/>
-      <w:r>
-        <w:t xml:space="preserve"> E2E corren en CI de forma </w:t>
-      </w:r>
-      <w:proofErr w:type="spellStart"/>
-      <w:r>
-        <w:t>headless</w:t>
-      </w:r>
-      <w:proofErr w:type="spellEnd"/>
-      <w:r>
-        <w:t>.</w:t>
-      </w:r>
-    </w:p>
-    <w:p>
-      <w:pPr>
-        <w:pStyle w:val="ListBullet"/>
-      </w:pPr>
-      <w:r>
-        <w:t>Se cubren los caminos felices y al menos un error.</w:t>
-      </w:r>
-    </w:p>
-    <w:p>
-      <w:pPr>
-        <w:pStyle w:val="Heading2"/>
-      </w:pPr>
-      <w:bookmarkStart w:id="101" w:name="_Toc234359040"/>
-      <w:r>
-        <w:rPr>
-          <w:rFonts w:ascii="Calibri" w:hAnsi="Calibri"/>
-        </w:rPr>
-        <w:t>4.4 DevOps</w:t>
-      </w:r>
-      <w:bookmarkEnd w:id="101"/>
-    </w:p>
-    <w:p>
-      <w:pPr>
-        <w:pStyle w:val="Heading3"/>
-      </w:pPr>
-      <w:bookmarkStart w:id="102" w:name="_Toc234359041"/>
-      <w:r>
-        <w:rPr>
-          <w:rFonts w:ascii="Calibri" w:hAnsi="Calibri"/>
-        </w:rPr>
-        <w:t xml:space="preserve">HU-073 - </w:t>
-      </w:r>
-      <w:proofErr w:type="spellStart"/>
-      <w:r>
-        <w:rPr>
-          <w:rFonts w:ascii="Calibri" w:hAnsi="Calibri"/>
-        </w:rPr>
-        <w:t>Containerización</w:t>
-      </w:r>
-      <w:proofErr w:type="spellEnd"/>
-      <w:r>
-        <w:rPr>
-          <w:rFonts w:ascii="Calibri" w:hAnsi="Calibri"/>
-        </w:rPr>
-        <w:t xml:space="preserve"> y CI/CD</w:t>
-      </w:r>
-      <w:bookmarkEnd w:id="102"/>
-    </w:p>
-    <w:p>
-      <w:r>
-        <w:rPr>
-          <w:color w:val="555555"/>
-          <w:sz w:val="18"/>
-        </w:rPr>
-        <w:t>Estado: Pendiente   |   Prioridad: Alta   |   Módulo: DevOps   |   Tipo: No funcional</w:t>
-      </w:r>
-    </w:p>
-    <w:p>
-      <w:r>
-        <w:rPr>
-          <w:b/>
-        </w:rPr>
-        <w:t xml:space="preserve">Historia: </w:t>
-      </w:r>
-      <w:r>
-        <w:t xml:space="preserve">Como DevOps / Plataforma, quiero disponer de </w:t>
-      </w:r>
-      <w:proofErr w:type="spellStart"/>
-      <w:r>
-        <w:t>Dockerfile</w:t>
-      </w:r>
-      <w:proofErr w:type="spellEnd"/>
-      <w:r>
-        <w:t xml:space="preserve"> y un pipeline de CI/CD (GitHub </w:t>
-      </w:r>
-      <w:proofErr w:type="spellStart"/>
-      <w:r>
-        <w:t>Actions</w:t>
-      </w:r>
-      <w:proofErr w:type="spellEnd"/>
-      <w:r>
-        <w:t>), para lograr despliegues reproducibles y sin error humano.</w:t>
-      </w:r>
-    </w:p>
-    <w:p>
-      <w:r>
-        <w:lastRenderedPageBreak/>
-        <w:t>Criterios de aceptación:</w:t>
-      </w:r>
-    </w:p>
-    <w:p>
-      <w:pPr>
-        <w:pStyle w:val="ListBullet"/>
-      </w:pPr>
-      <w:r>
-        <w:t xml:space="preserve">Existe un </w:t>
-      </w:r>
-      <w:proofErr w:type="spellStart"/>
-      <w:r>
-        <w:t>Dockerfile</w:t>
-      </w:r>
-      <w:proofErr w:type="spellEnd"/>
-      <w:r>
-        <w:t xml:space="preserve"> que construye la aplicación.</w:t>
-      </w:r>
-    </w:p>
-    <w:p>
-      <w:pPr>
-        <w:pStyle w:val="ListBullet"/>
-      </w:pPr>
-      <w:r>
-        <w:t xml:space="preserve">El pipeline ejecuta </w:t>
-      </w:r>
-      <w:proofErr w:type="spellStart"/>
-      <w:r>
-        <w:t>build</w:t>
-      </w:r>
-      <w:proofErr w:type="spellEnd"/>
-      <w:r>
-        <w:t xml:space="preserve">, </w:t>
-      </w:r>
-      <w:proofErr w:type="spellStart"/>
-      <w:r>
-        <w:t>lint</w:t>
-      </w:r>
-      <w:proofErr w:type="spellEnd"/>
-      <w:r>
-        <w:t xml:space="preserve"> y </w:t>
-      </w:r>
-      <w:proofErr w:type="spellStart"/>
-      <w:r>
-        <w:t>tests</w:t>
-      </w:r>
-      <w:proofErr w:type="spellEnd"/>
-      <w:r>
-        <w:t xml:space="preserve"> en cada </w:t>
-      </w:r>
-      <w:proofErr w:type="spellStart"/>
-      <w:r>
-        <w:t>push</w:t>
-      </w:r>
-      <w:proofErr w:type="spellEnd"/>
-      <w:r>
-        <w:t>.</w:t>
-      </w:r>
-    </w:p>
-    <w:p>
-      <w:pPr>
-        <w:pStyle w:val="ListBullet"/>
-      </w:pPr>
-      <w:r>
-        <w:t>El despliegue se automatiza tras pasar el pipeline.</w:t>
-      </w:r>
-    </w:p>
-    <w:p>
-      <w:pPr>
-        <w:pStyle w:val="Heading3"/>
-      </w:pPr>
-      <w:bookmarkStart w:id="103" w:name="_Toc234359042"/>
-      <w:r>
-        <w:rPr>
-          <w:rFonts w:ascii="Calibri" w:hAnsi="Calibri"/>
-        </w:rPr>
-        <w:t xml:space="preserve">HU-074 - </w:t>
-      </w:r>
-      <w:proofErr w:type="spellStart"/>
-      <w:r>
-        <w:rPr>
-          <w:rFonts w:ascii="Calibri" w:hAnsi="Calibri"/>
-        </w:rPr>
-        <w:t>Backups</w:t>
-      </w:r>
-      <w:proofErr w:type="spellEnd"/>
-      <w:r>
-        <w:rPr>
-          <w:rFonts w:ascii="Calibri" w:hAnsi="Calibri"/>
-        </w:rPr>
-        <w:t xml:space="preserve"> automatizados de MongoDB Atlas</w:t>
-      </w:r>
-      <w:bookmarkEnd w:id="103"/>
-    </w:p>
-    <w:p>
-      <w:r>
-        <w:rPr>
-          <w:color w:val="555555"/>
-          <w:sz w:val="18"/>
-        </w:rPr>
-        <w:t>Estado: Pendiente   |   Prioridad: Alta   |   Módulo: DevOps   |   Tipo: No funcional</w:t>
-      </w:r>
-    </w:p>
-    <w:p>
-      <w:r>
-        <w:rPr>
-          <w:b/>
-        </w:rPr>
-        <w:t xml:space="preserve">Historia: </w:t>
-      </w:r>
-      <w:r>
-        <w:t xml:space="preserve">Como DevOps / Plataforma, quiero contar con </w:t>
-      </w:r>
-      <w:proofErr w:type="spellStart"/>
-      <w:r>
-        <w:t>backups</w:t>
-      </w:r>
-      <w:proofErr w:type="spellEnd"/>
-      <w:r>
-        <w:t xml:space="preserve"> automáticos y restaurables de la base de datos, para recuperar la información ante una </w:t>
-      </w:r>
-      <w:proofErr w:type="spellStart"/>
-      <w:r>
-        <w:t>perdida</w:t>
-      </w:r>
-      <w:proofErr w:type="spellEnd"/>
-      <w:r>
-        <w:t xml:space="preserve"> de datos.</w:t>
-      </w:r>
-    </w:p>
-    <w:p>
-      <w:r>
-        <w:t>Criterios de aceptación:</w:t>
-      </w:r>
-    </w:p>
-    <w:p>
-      <w:pPr>
-        <w:pStyle w:val="ListBullet"/>
-      </w:pPr>
-      <w:r>
-        <w:t xml:space="preserve">Los </w:t>
-      </w:r>
-      <w:proofErr w:type="spellStart"/>
-      <w:r>
-        <w:t>backups</w:t>
-      </w:r>
-      <w:proofErr w:type="spellEnd"/>
-      <w:r>
-        <w:t xml:space="preserve"> se ejecutan de forma automática y periódica.</w:t>
-      </w:r>
-    </w:p>
-    <w:p>
-      <w:pPr>
-        <w:pStyle w:val="ListBullet"/>
-      </w:pPr>
-      <w:r>
-        <w:t>Se valida la restauración en un entorno de prueba.</w:t>
-      </w:r>
-    </w:p>
-    <w:p>
-      <w:pPr>
-        <w:pStyle w:val="ListBullet"/>
-      </w:pPr>
-      <w:r>
-        <w:t>Se define una política de retención.</w:t>
-      </w:r>
-    </w:p>
-    <w:p>
-      <w:pPr>
-        <w:pStyle w:val="Heading3"/>
-      </w:pPr>
-      <w:bookmarkStart w:id="104" w:name="_Toc234359043"/>
-      <w:r>
-        <w:rPr>
-          <w:rFonts w:ascii="Calibri" w:hAnsi="Calibri"/>
-        </w:rPr>
-        <w:t xml:space="preserve">HU-075 - Ambiente de </w:t>
-      </w:r>
-      <w:proofErr w:type="spellStart"/>
-      <w:r>
-        <w:rPr>
-          <w:rFonts w:ascii="Calibri" w:hAnsi="Calibri"/>
-        </w:rPr>
-        <w:t>staging</w:t>
-      </w:r>
-      <w:proofErr w:type="spellEnd"/>
-      <w:r>
-        <w:rPr>
-          <w:rFonts w:ascii="Calibri" w:hAnsi="Calibri"/>
-        </w:rPr>
-        <w:t xml:space="preserve"> separado</w:t>
-      </w:r>
-      <w:bookmarkEnd w:id="104"/>
-    </w:p>
-    <w:p>
-      <w:r>
-        <w:rPr>
-          <w:color w:val="555555"/>
-          <w:sz w:val="18"/>
-        </w:rPr>
-        <w:t>Estado: Pendiente   |   Prioridad: Alta   |   Módulo: DevOps   |   Tipo: No funcional</w:t>
-      </w:r>
-    </w:p>
-    <w:p>
-      <w:r>
-        <w:rPr>
-          <w:b/>
-        </w:rPr>
-        <w:t xml:space="preserve">Historia: </w:t>
-      </w:r>
-      <w:r>
-        <w:t xml:space="preserve">Como DevOps / Plataforma, quiero disponer de un entorno de </w:t>
-      </w:r>
-      <w:proofErr w:type="spellStart"/>
-      <w:r>
-        <w:t>staging</w:t>
-      </w:r>
-      <w:proofErr w:type="spellEnd"/>
-      <w:r>
-        <w:t xml:space="preserve"> separado de producción, para probar cambios antes de liberarlos a clientes.</w:t>
-      </w:r>
-    </w:p>
-    <w:p>
-      <w:r>
-        <w:t>Criterios de aceptación:</w:t>
-      </w:r>
-    </w:p>
-    <w:p>
-      <w:pPr>
-        <w:pStyle w:val="ListBullet"/>
-      </w:pPr>
-      <w:r>
-        <w:t xml:space="preserve">Existe un entorno </w:t>
-      </w:r>
-      <w:proofErr w:type="spellStart"/>
-      <w:r>
-        <w:t>staging</w:t>
-      </w:r>
-      <w:proofErr w:type="spellEnd"/>
-      <w:r>
-        <w:t xml:space="preserve"> con datos no productivos.</w:t>
-      </w:r>
-    </w:p>
-    <w:p>
-      <w:pPr>
-        <w:pStyle w:val="ListBullet"/>
-      </w:pPr>
-      <w:r>
-        <w:t xml:space="preserve">El pipeline despliega a </w:t>
-      </w:r>
-      <w:proofErr w:type="spellStart"/>
-      <w:r>
-        <w:t>staging</w:t>
-      </w:r>
-      <w:proofErr w:type="spellEnd"/>
-      <w:r>
-        <w:t xml:space="preserve"> antes que a producción.</w:t>
-      </w:r>
-    </w:p>
-    <w:p>
-      <w:pPr>
-        <w:pStyle w:val="ListBullet"/>
-      </w:pPr>
-      <w:proofErr w:type="spellStart"/>
-      <w:r>
-        <w:t>Staging</w:t>
-      </w:r>
-      <w:proofErr w:type="spellEnd"/>
-      <w:r>
-        <w:t xml:space="preserve"> replica la configuración de producción.</w:t>
-      </w:r>
-    </w:p>
-    <w:p>
-      <w:pPr>
-        <w:pStyle w:val="Heading3"/>
-      </w:pPr>
-      <w:bookmarkStart w:id="105" w:name="_Toc234359044"/>
-      <w:r>
-        <w:rPr>
-          <w:rFonts w:ascii="Calibri" w:hAnsi="Calibri"/>
-        </w:rPr>
-        <w:t xml:space="preserve">HU-076 - Estrategia de </w:t>
-      </w:r>
-      <w:proofErr w:type="spellStart"/>
-      <w:r>
-        <w:rPr>
-          <w:rFonts w:ascii="Calibri" w:hAnsi="Calibri"/>
-        </w:rPr>
-        <w:t>rollback</w:t>
-      </w:r>
-      <w:bookmarkEnd w:id="105"/>
-      <w:proofErr w:type="spellEnd"/>
-    </w:p>
-    <w:p>
-      <w:r>
-        <w:rPr>
-          <w:color w:val="555555"/>
-          <w:sz w:val="18"/>
-        </w:rPr>
-        <w:t>Estado: Pendiente   |   Prioridad: Media   |   Módulo: DevOps   |   Tipo: No funcional</w:t>
-      </w:r>
-    </w:p>
-    <w:p>
-      <w:r>
-        <w:rPr>
-          <w:b/>
-        </w:rPr>
-        <w:t xml:space="preserve">Historia: </w:t>
-      </w:r>
-      <w:r>
-        <w:t>Como DevOps / Plataforma, quiero poder revertir rápidamente un despliegue defectuoso, para mitigar el impacto de un bug crítico.</w:t>
-      </w:r>
-    </w:p>
-    <w:p>
-      <w:r>
-        <w:t>Criterios de aceptación:</w:t>
-      </w:r>
-    </w:p>
-    <w:p>
-      <w:pPr>
-        <w:pStyle w:val="ListBullet"/>
-      </w:pPr>
-      <w:r>
-        <w:t>El sistema permite volver a la versión anterior con un paso.</w:t>
-      </w:r>
-    </w:p>
-    <w:p>
-      <w:pPr>
-        <w:pStyle w:val="ListBullet"/>
-      </w:pPr>
-      <w:r>
-        <w:t xml:space="preserve">El </w:t>
-      </w:r>
-      <w:proofErr w:type="spellStart"/>
-      <w:r>
-        <w:t>rollback</w:t>
-      </w:r>
-      <w:proofErr w:type="spellEnd"/>
-      <w:r>
-        <w:t xml:space="preserve"> está documentado y probado.</w:t>
-      </w:r>
-    </w:p>
-    <w:p>
-      <w:pPr>
-        <w:pStyle w:val="ListBullet"/>
-      </w:pPr>
-      <w:r>
-        <w:t>Las migraciones de datos son compatibles hacia atrás cuando es posible.</w:t>
-      </w:r>
-    </w:p>
-    <w:p>
-      <w:pPr>
-        <w:pStyle w:val="Heading2"/>
-      </w:pPr>
-      <w:bookmarkStart w:id="106" w:name="_Toc234359045"/>
-      <w:r>
-        <w:rPr>
-          <w:rFonts w:ascii="Calibri" w:hAnsi="Calibri"/>
-        </w:rPr>
-        <w:t>4.5 Escalabilidad</w:t>
-      </w:r>
-      <w:bookmarkEnd w:id="106"/>
-    </w:p>
-    <w:p>
-      <w:pPr>
-        <w:pStyle w:val="Heading3"/>
-      </w:pPr>
-      <w:bookmarkStart w:id="107" w:name="_Toc234359046"/>
-      <w:r>
-        <w:rPr>
-          <w:rFonts w:ascii="Calibri" w:hAnsi="Calibri"/>
-        </w:rPr>
-        <w:t>HU-077 - Cache de catálogo con Redis</w:t>
-      </w:r>
-      <w:bookmarkEnd w:id="107"/>
-    </w:p>
-    <w:p>
-      <w:r>
-        <w:rPr>
-          <w:color w:val="555555"/>
-          <w:sz w:val="18"/>
-        </w:rPr>
-        <w:t>Estado: Pendiente   |   Prioridad: Media   |   Módulo: Escalabilidad   |   Tipo: No funcional</w:t>
-      </w:r>
-    </w:p>
-    <w:p>
-      <w:r>
-        <w:rPr>
-          <w:b/>
-        </w:rPr>
-        <w:lastRenderedPageBreak/>
-        <w:t xml:space="preserve">Historia: </w:t>
-      </w:r>
-      <w:r>
-        <w:t>Como Sistema, quiero cachear las respuestas del catálogo en Redis, para reducir los accesos a la base de datos y mejorar el rendimiento.</w:t>
-      </w:r>
-    </w:p>
-    <w:p>
-      <w:r>
-        <w:t>Criterios de aceptación:</w:t>
-      </w:r>
-    </w:p>
-    <w:p>
-      <w:pPr>
-        <w:pStyle w:val="ListBullet"/>
-      </w:pPr>
-      <w:r>
-        <w:t>Las consultas de catálogo frecuentes se sirven desde cache.</w:t>
-      </w:r>
-    </w:p>
-    <w:p>
-      <w:pPr>
-        <w:pStyle w:val="ListBullet"/>
-      </w:pPr>
-      <w:r>
-        <w:t>La cache se invalida al actualizar productos.</w:t>
-      </w:r>
-    </w:p>
-    <w:p>
-      <w:pPr>
-        <w:pStyle w:val="ListBullet"/>
-      </w:pPr>
-      <w:r>
-        <w:t>Se define un TTL adecuado.</w:t>
-      </w:r>
-    </w:p>
-    <w:p>
-      <w:pPr>
-        <w:pStyle w:val="Heading3"/>
-      </w:pPr>
-      <w:bookmarkStart w:id="108" w:name="_Toc234359047"/>
-      <w:r>
-        <w:rPr>
-          <w:rFonts w:ascii="Calibri" w:hAnsi="Calibri"/>
-        </w:rPr>
-        <w:t xml:space="preserve">HU-078 - Entrega de imágenes vía </w:t>
-      </w:r>
-      <w:proofErr w:type="spellStart"/>
-      <w:r>
-        <w:rPr>
-          <w:rFonts w:ascii="Calibri" w:hAnsi="Calibri"/>
-        </w:rPr>
-        <w:t>Cloudinary</w:t>
-      </w:r>
-      <w:proofErr w:type="spellEnd"/>
-      <w:r>
-        <w:rPr>
-          <w:rFonts w:ascii="Calibri" w:hAnsi="Calibri"/>
-        </w:rPr>
-        <w:t xml:space="preserve"> (CDN)</w:t>
-      </w:r>
-      <w:bookmarkEnd w:id="108"/>
-    </w:p>
-    <w:p>
-      <w:r>
-        <w:rPr>
-          <w:color w:val="555555"/>
-          <w:sz w:val="18"/>
-        </w:rPr>
-        <w:t>Estado: Pendiente   |   Prioridad: Alta   |   Módulo: Escalabilidad   |   Tipo: No funcional</w:t>
-      </w:r>
-    </w:p>
-    <w:p>
-      <w:r>
-        <w:rPr>
-          <w:b/>
-        </w:rPr>
-        <w:t xml:space="preserve">Historia: </w:t>
-      </w:r>
-      <w:r>
-        <w:t xml:space="preserve">Como Sistema, quiero almacenar y servir las imágenes de productos a través de </w:t>
-      </w:r>
-      <w:proofErr w:type="spellStart"/>
-      <w:r>
-        <w:t>Cloudinary</w:t>
-      </w:r>
-      <w:proofErr w:type="spellEnd"/>
-      <w:r>
-        <w:t>, para escalar la entrega con su CDN global y reducir latencia sin gestionar infraestructura propia.</w:t>
-      </w:r>
-    </w:p>
-    <w:p>
-      <w:r>
-        <w:t>Criterios de aceptación:</w:t>
-      </w:r>
-    </w:p>
-    <w:p>
-      <w:pPr>
-        <w:pStyle w:val="ListBullet"/>
-      </w:pPr>
-      <w:r>
-        <w:t xml:space="preserve">Las imágenes se almacenan y sirven desde </w:t>
-      </w:r>
-      <w:proofErr w:type="spellStart"/>
-      <w:r>
-        <w:t>Cloudinary</w:t>
-      </w:r>
-      <w:proofErr w:type="spellEnd"/>
-      <w:r>
-        <w:t xml:space="preserve"> (CDN), no desde el servidor de la </w:t>
-      </w:r>
-      <w:proofErr w:type="gramStart"/>
-      <w:r>
-        <w:t>app</w:t>
-      </w:r>
-      <w:proofErr w:type="gramEnd"/>
-      <w:r>
-        <w:t>.</w:t>
-      </w:r>
-    </w:p>
-    <w:p>
-      <w:pPr>
-        <w:pStyle w:val="ListBullet"/>
-      </w:pPr>
-      <w:r>
-        <w:t xml:space="preserve">Las </w:t>
-      </w:r>
-      <w:proofErr w:type="spellStart"/>
-      <w:r>
-        <w:t>URLs</w:t>
-      </w:r>
-      <w:proofErr w:type="spellEnd"/>
-      <w:r>
-        <w:t xml:space="preserve"> apuntan a </w:t>
-      </w:r>
-      <w:proofErr w:type="spellStart"/>
-      <w:r>
-        <w:t>Cloudinary</w:t>
-      </w:r>
-      <w:proofErr w:type="spellEnd"/>
-      <w:r>
-        <w:t xml:space="preserve"> con transformaciones (</w:t>
-      </w:r>
-      <w:proofErr w:type="spellStart"/>
-      <w:r>
-        <w:t>resize</w:t>
-      </w:r>
-      <w:proofErr w:type="spellEnd"/>
-      <w:r>
-        <w:t>, recorte, formato) bajo demanda.</w:t>
-      </w:r>
-    </w:p>
-    <w:p>
-      <w:pPr>
-        <w:pStyle w:val="ListBullet"/>
-      </w:pPr>
-      <w:r>
         <w:t>El propio CDN aplica cabeceras de cache de larga duración.</w:t>
-      </w:r>
-    </w:p>
-    <w:p>
-      <w:pPr>
-        <w:pStyle w:val="Heading3"/>
-      </w:pPr>
-      <w:bookmarkStart w:id="109" w:name="_Toc234359048"/>
-      <w:r>
-        <w:rPr>
-          <w:rFonts w:ascii="Calibri" w:hAnsi="Calibri"/>
-        </w:rPr>
-        <w:t xml:space="preserve">HU-079 - Cola de emails y trabajos en </w:t>
-      </w:r>
-      <w:proofErr w:type="spellStart"/>
-      <w:r>
-        <w:rPr>
-          <w:rFonts w:ascii="Calibri" w:hAnsi="Calibri"/>
-        </w:rPr>
-        <w:t>background</w:t>
-      </w:r>
-      <w:bookmarkEnd w:id="109"/>
-      <w:proofErr w:type="spellEnd"/>
-    </w:p>
-    <w:p>
-      <w:r>
-        <w:rPr>
-          <w:color w:val="555555"/>
-          <w:sz w:val="18"/>
-        </w:rPr>
-        <w:t>Estado: Pendiente   |   Prioridad: Media   |   Módulo: Escalabilidad   |   Tipo: No funcional</w:t>
-      </w:r>
-    </w:p>
-    <w:p>
-      <w:r>
-        <w:rPr>
-          <w:b/>
-        </w:rPr>
-        <w:t xml:space="preserve">Historia: </w:t>
-      </w:r>
-      <w:r>
-        <w:t>Como Sistema, quiero procesar emails y tareas pesadas en una cola en segundo plano, para no bloquear las respuestas del servidor.</w:t>
-      </w:r>
-    </w:p>
-    <w:p>
-      <w:r>
-        <w:t>Criterios de aceptación:</w:t>
-      </w:r>
-    </w:p>
-    <w:p>
-      <w:pPr>
-        <w:pStyle w:val="ListBullet"/>
-      </w:pPr>
-      <w:r>
-        <w:t>El envío de emails se encola y procesa de forma asíncrona.</w:t>
-      </w:r>
-    </w:p>
-    <w:p>
-      <w:pPr>
-        <w:pStyle w:val="ListBullet"/>
-      </w:pPr>
-      <w:r>
-        <w:t xml:space="preserve">Los trabajos fallidos se reintentan con </w:t>
-      </w:r>
-      <w:proofErr w:type="spellStart"/>
-      <w:r>
-        <w:t>backoff</w:t>
-      </w:r>
-      <w:proofErr w:type="spellEnd"/>
-      <w:r>
-        <w:t>.</w:t>
-      </w:r>
-    </w:p>
-    <w:p>
-      <w:pPr>
-        <w:pStyle w:val="ListBullet"/>
-      </w:pPr>
-      <w:r>
-        <w:t>El estado de la cola es observable.</w:t>
       </w:r>
     </w:p>
     <w:p>

</xml_diff>

<commit_message>
fix(hu-054): quitar contador de errores recientes del panel de analitica
Dependia del modelo ErrorReport de HU-067 (error tracking), que se
elimino del proyecto por no ser funcional. Se quita el conteo de
errores del endpoint /admin/analytics/product, de la tool MCP
analytics.getProductAnalytics, y de la tarjeta correspondiente en el
panel. Ajustado el docx (criterio de aceptacion e historia de HU-054).
</commit_message>
<xml_diff>
--- a/deliverables/Healthora-Historias-de-Usuario.docx
+++ b/deliverables/Healthora-Historias-de-Usuario.docx
@@ -21576,72 +21576,49 @@
         <w:rPr>
           <w:b/>
         </w:rPr>
-        <w:lastRenderedPageBreak/>
-        <w:t xml:space="preserve">Historia: </w:t>
-      </w:r>
-      <w:r>
-        <w:t xml:space="preserve">Como Administrador, quiero ver un panel de analítica de producto con </w:t>
-      </w:r>
+        <w:t>Historia: Como Administrador, quiero ver un panel de analítica de producto con PostHog (embudos, conversión y abandono de carrito), para tomar decisiones basadas en el comportamiento real de los usuarios.</w:t>
+      </w:r>
+      <w:r/>
       <w:proofErr w:type="spellStart"/>
+      <w:r/>
+      <w:proofErr w:type="spellEnd"/>
+      <w:r/>
+    </w:p>
+    <w:p>
+      <w:r>
+        <w:t>Criterios de aceptación:</w:t>
+      </w:r>
+    </w:p>
+    <w:p>
+      <w:pPr>
+        <w:pStyle w:val="ListBullet"/>
+      </w:pPr>
+      <w:r>
+        <w:t xml:space="preserve">El panel muestra el embudo de </w:t>
+      </w:r>
+      <w:proofErr w:type="spellStart"/>
+      <w:r>
+        <w:t>checkout</w:t>
+      </w:r>
+      <w:proofErr w:type="spellEnd"/>
+      <w:r>
+        <w:t xml:space="preserve"> y la tasa de conversión por periodo.</w:t>
+      </w:r>
+    </w:p>
+    <w:p>
+      <w:pPr>
+        <w:pStyle w:val="ListBullet"/>
+      </w:pPr>
+      <w:r>
+        <w:t xml:space="preserve">Se visualiza el abandono de carrito y los eventos clave capturados por </w:t>
+      </w:r>
+      <w:proofErr w:type="spellStart"/>
       <w:r>
         <w:t>PostHog</w:t>
       </w:r>
       <w:proofErr w:type="spellEnd"/>
       <w:r>
-        <w:t xml:space="preserve"> (embudos, conversión, abandono de carrito y errores recientes), para tomar decisiones basadas en el comportamiento real de los usuarios.</w:t>
-      </w:r>
-    </w:p>
-    <w:p>
-      <w:r>
-        <w:t>Criterios de aceptación:</w:t>
-      </w:r>
-    </w:p>
-    <w:p>
-      <w:pPr>
-        <w:pStyle w:val="ListBullet"/>
-      </w:pPr>
-      <w:r>
-        <w:t xml:space="preserve">El panel muestra el embudo de </w:t>
-      </w:r>
-      <w:proofErr w:type="spellStart"/>
-      <w:r>
-        <w:t>checkout</w:t>
-      </w:r>
-      <w:proofErr w:type="spellEnd"/>
-      <w:r>
-        <w:t xml:space="preserve"> y la tasa de conversión por periodo.</w:t>
-      </w:r>
-    </w:p>
-    <w:p>
-      <w:pPr>
-        <w:pStyle w:val="ListBullet"/>
-      </w:pPr>
-      <w:r>
-        <w:t xml:space="preserve">Se visualiza el abandono de carrito y los eventos clave capturados por </w:t>
-      </w:r>
-      <w:proofErr w:type="spellStart"/>
-      <w:r>
-        <w:t>PostHog</w:t>
-      </w:r>
-      <w:proofErr w:type="spellEnd"/>
-      <w:r>
         <w:t>.</w:t>
-      </w:r>
-    </w:p>
-    <w:p>
-      <w:pPr>
-        <w:pStyle w:val="ListBullet"/>
-      </w:pPr>
-      <w:r>
-        <w:t xml:space="preserve">El panel lista los errores recientes capturados (error tracking de </w:t>
-      </w:r>
-      <w:proofErr w:type="spellStart"/>
-      <w:r>
-        <w:t>PostHog</w:t>
-      </w:r>
-      <w:proofErr w:type="spellEnd"/>
-      <w:r>
-        <w:t>).</w:t>
       </w:r>
     </w:p>
     <w:p>

</xml_diff>

<commit_message>
docs(historias): marcar HU-048/HU-053/HU-058/HU-060 como implementadas
Las 4 ya tenian el codigo mergeado (PR #212, #266, #269, #267) pero el
.docx fuente seguia con Estado: Pendiente/Parcial. Actualizado a
Estado: Implementada en las 4, y re-exportado el pdf via Word COM.

Con esto el .docx queda 68/68 en los requisitos funcionales (Secciones
I + II) - no queda ninguna HU pendiente.

Co-Authored-By: Claude Sonnet 5 <noreply@anthropic.com>
</commit_message>
<xml_diff>
--- a/deliverables/Healthora-Historias-de-Usuario.docx
+++ b/deliverables/Healthora-Historias-de-Usuario.docx
@@ -18426,7 +18426,7 @@
           <w:color w:val="555555"/>
           <w:sz w:val="18"/>
         </w:rPr>
-        <w:t>Estado: Pendiente   |   Prioridad: Alta   |   Módulo: Administración   |   Tipo: Funcional</w:t>
+        <w:t>Estado: Implementada   |   Prioridad: Alta   |   Módulo: Administración   |   Tipo: Funcional</w:t>
       </w:r>
     </w:p>
     <w:p>
@@ -19328,7 +19328,7 @@
           <w:color w:val="555555"/>
           <w:sz w:val="18"/>
         </w:rPr>
-        <w:t>Estado: Pendiente   |   Prioridad: Baja   |   Módulo: Administración   |   Tipo: Funcional</w:t>
+        <w:t>Estado: Implementada   |   Prioridad: Baja   |   Módulo: Administración   |   Tipo: Funcional</w:t>
       </w:r>
     </w:p>
     <w:p>
@@ -20052,7 +20052,7 @@
           <w:color w:val="555555"/>
           <w:sz w:val="18"/>
         </w:rPr>
-        <w:t>Estado: Pendiente   |   Prioridad: Media   |   Módulo: Usuarios   |   Tipo: Funcional</w:t>
+        <w:t>Estado: Implementada   |   Prioridad: Media   |   Módulo: Usuarios   |   Tipo: Funcional</w:t>
       </w:r>
     </w:p>
     <w:p>
@@ -20177,7 +20177,7 @@
           <w:color w:val="555555"/>
           <w:sz w:val="18"/>
         </w:rPr>
-        <w:t>Estado: Parcial   |   Prioridad: Baja   |   Módulo: Usuarios   |   Tipo: Funcional</w:t>
+        <w:t>Estado: Implementada   |   Prioridad: Baja   |   Módulo: Usuarios   |   Tipo: Funcional</w:t>
       </w:r>
     </w:p>
     <w:p>

</xml_diff>